<commit_message>
Actualiza Genética del Grupo 4 y renueva informe y presentación
</commit_message>
<xml_diff>
--- a/exposiciones/assets/descargas/informe-determinacion-sexual-animal.docx
+++ b/exposiciones/assets/descargas/informe-determinacion-sexual-animal.docx
@@ -40,57 +40,101 @@
     </w:p>
     <w:p>
       <w:pPr>
-        <w:spacing w:after="680"/>
+        <w:spacing w:after="440"/>
       </w:pPr>
+      <w:r/>
     </w:p>
     <w:p>
       <w:pPr>
         <w:pStyle w:val="Title"/>
-        <w:spacing w:after="600"/>
+        <w:spacing w:after="480"/>
         <w:jc w:val="center"/>
       </w:pPr>
       <w:r>
         <w:t>Cromosomas sexuales</w:t>
         <w:br/>
-        <w:t>diferenciación sexual y sistemas básicos</w:t>
+        <w:t>diferenciación sexual y sistemas de</w:t>
         <w:br/>
-        <w:t>de determinación sexual en animales</w:t>
+        <w:t>determinación sexual en animales</w:t>
       </w:r>
     </w:p>
     <w:p>
       <w:pPr>
-        <w:spacing w:after="340"/>
+        <w:spacing w:after="200"/>
         <w:jc w:val="center"/>
       </w:pPr>
       <w:r>
         <w:t>Investigación bibliográfica</w:t>
+        <w:br/>
+        <w:t>Grupo 4</w:t>
       </w:r>
     </w:p>
     <w:p>
       <w:pPr>
-        <w:spacing w:after="340"/>
+        <w:spacing w:after="200"/>
         <w:jc w:val="center"/>
       </w:pPr>
       <w:r>
-        <w:t>Asignatura</w:t>
-        <w:br/>
         <w:t>Genética y Mejoramiento Animal</w:t>
       </w:r>
     </w:p>
     <w:p>
       <w:pPr>
-        <w:spacing w:after="340"/>
+        <w:spacing w:after="200"/>
         <w:jc w:val="center"/>
       </w:pPr>
       <w:r>
-        <w:t>Estudiante</w:t>
-        <w:br/>
+        <w:t>Integrantes</w:t>
+      </w:r>
+    </w:p>
+    <w:p>
+      <w:pPr>
+        <w:spacing w:after="100"/>
+        <w:jc w:val="center"/>
+      </w:pPr>
+      <w:r>
         <w:t>Juan José Bajaña Chuno</w:t>
       </w:r>
     </w:p>
     <w:p>
       <w:pPr>
-        <w:spacing w:after="340"/>
+        <w:spacing w:after="100"/>
+        <w:jc w:val="center"/>
+      </w:pPr>
+      <w:r>
+        <w:t>Britney Gissel Cujilema Montero</w:t>
+      </w:r>
+    </w:p>
+    <w:p>
+      <w:pPr>
+        <w:spacing w:after="100"/>
+        <w:jc w:val="center"/>
+      </w:pPr>
+      <w:r>
+        <w:t>Joselyn María Pambi Gaona</w:t>
+      </w:r>
+    </w:p>
+    <w:p>
+      <w:pPr>
+        <w:spacing w:after="100"/>
+        <w:jc w:val="center"/>
+      </w:pPr>
+      <w:r>
+        <w:t>Guillermo Ramiro Ramírez Medina</w:t>
+      </w:r>
+    </w:p>
+    <w:p>
+      <w:pPr>
+        <w:spacing w:after="100"/>
+        <w:jc w:val="center"/>
+      </w:pPr>
+      <w:r>
+        <w:t>Dennisse Carolina Silva Del Rosario</w:t>
+      </w:r>
+    </w:p>
+    <w:p>
+      <w:pPr>
+        <w:spacing w:before="400"/>
         <w:jc w:val="center"/>
       </w:pPr>
       <w:r>
@@ -101,13 +145,13 @@
     </w:p>
     <w:p>
       <w:pPr>
-        <w:spacing w:after="340"/>
+        <w:spacing w:before="240"/>
         <w:jc w:val="center"/>
       </w:pPr>
       <w:r>
         <w:t>Machala Ecuador</w:t>
         <w:br/>
-        <w:t>17 de octubre de 2026</w:t>
+        <w:t>19 de octubre de 2026</w:t>
       </w:r>
     </w:p>
     <w:p>
@@ -121,17 +165,17 @@
     </w:p>
     <w:p>
       <w:r>
-        <w:t>El desarrollo sexual de los animales comprende procesos relacionados, pero diferenciables. La constitución cromosómica aporta señales iniciales; la determinación gonadal establece la organización de un testículo o un ovario; y la diferenciación sexual produce características anatómicas y funcionales mediante respuestas celulares y hormonales. En los mamíferos domésticos, el sistema XX/XY constituye el patrón habitual, aunque la correspondencia entre cromosomas, gónadas y fenotipo puede alterarse. (1,2)</w:t>
+        <w:t>Los cromosomas sexuales contienen información genética que participa en la determinación del sexo en numerosas especies. En los mamíferos domésticos, las combinaciones XX y XY constituyen el modelo habitual. Sin embargo, comprender el desarrollo de un ovario, un testículo o los órganos reproductores requiere seguir también la actividad de genes, las señales hormonales y la respuesta de los tejidos embrionarios. (1,2)</w:t>
       </w:r>
     </w:p>
     <w:p>
       <w:r>
-        <w:t>La diversidad animal demuestra que no existe un único mecanismo aplicable a todas las especies. Aves, insectos, reptiles y peces utilizan combinaciones distintas de señales genéticas y ambientales. Incluso entre peces teleósteos hay diferencias importantes entre especies y poblaciones. Por tanto, interpretar el sexo de un animal exige conocer su biología reproductiva y evitar extrapolar automáticamente el modelo de los mamíferos. (3)</w:t>
+        <w:t>La determinación sexual establece una dirección del desarrollo, mientras que la diferenciación sexual comprende la formación y especialización progresiva de las gónadas y de los órganos reproductores. Para estudiar estas relaciones se distinguen cuatro niveles: cromosómico, gonadal, hormonal y anatómico o fenotípico. Esta organización ayuda a explicar por qué la constitución cromosómica y la apariencia externa aportan información diferente. (2)</w:t>
       </w:r>
     </w:p>
     <w:p>
       <w:r>
-        <w:t>En Medicina Veterinaria, estos fundamentos permiten interpretar problemas del desarrollo reproductivo, orientar la evaluación de animales destinados a reproducción y comprender la gestión de poblaciones. El presente informe explica los mecanismos básicos y los relaciona con ejemplos de interés clínico y productivo.</w:t>
+        <w:t>El informe desarrolla tres ejes: qué son los cromosomas sexuales, cómo intervienen en la diferenciación sexual y cuáles son los sistemas básicos de determinación sexual en animales. El freemartinismo bovino se incorpora como ejemplo bibliográfico de la relación entre desarrollo fetal, circulación placentaria y diferenciación reproductiva.</w:t>
       </w:r>
     </w:p>
     <w:p>
@@ -152,7 +196,7 @@
     </w:p>
     <w:p>
       <w:r>
-        <w:t>Explicar la relación entre cromosomas sexuales, determinación gonadal y diferenciación sexual, comparando los sistemas básicos presentes en animales y sus aplicaciones veterinarias.</w:t>
+        <w:t>Explicar la función de los cromosomas sexuales y su relación con la diferenciación sexual, comparando los sistemas XX/XY, ZZ/ZW, haplodiploidía y determinación dependiente de la temperatura.</w:t>
       </w:r>
     </w:p>
     <w:p>
@@ -168,7 +212,7 @@
         <w:pStyle w:val="ListBullet"/>
       </w:pPr>
       <w:r>
-        <w:t>Distinguir sexo cromosómico, gonadal y fenotípico, así como homogametia y heterogametia.</w:t>
+        <w:t>Definir los cromosomas sexuales, distinguirlos de los autosomas y reconocer que contienen genes con diversas funciones.</w:t>
       </w:r>
     </w:p>
     <w:p>
@@ -176,7 +220,7 @@
         <w:pStyle w:val="ListBullet"/>
       </w:pPr>
       <w:r>
-        <w:t>Describir las principales vías genéticas y hormonales de la diferenciación sexual de los mamíferos domésticos.</w:t>
+        <w:t>Relacionar los cuatro niveles del desarrollo sexual con las vías gonadales y las principales señales hormonales del modelo mamífero.</w:t>
       </w:r>
     </w:p>
     <w:p>
@@ -184,7 +228,7 @@
         <w:pStyle w:val="ListBullet"/>
       </w:pPr>
       <w:r>
-        <w:t>Comparar los sistemas XX/XY, ZZ/ZW, XX/X0, haplodiploidía y determinación dependiente de la temperatura.</w:t>
+        <w:t>Comparar los sistemas de determinación sexual y explicar sus límites mediante los ejemplos de aves, abeja melífera y reptiles.</w:t>
       </w:r>
     </w:p>
     <w:p>
@@ -192,7 +236,7 @@
         <w:pStyle w:val="ListBullet"/>
       </w:pPr>
       <w:r>
-        <w:t>Relacionar los fundamentos con la diversidad sexual de peces y con alteraciones del desarrollo sexual en bovinos y perros.</w:t>
+        <w:t>Explicar el freemartinismo bovino mediante sus relaciones vasculares y sus consecuencias sobre el desarrollo reproductivo.</w:t>
       </w:r>
     </w:p>
     <w:p>
@@ -205,7 +249,7 @@
     </w:p>
     <w:p>
       <w:r>
-        <w:t>Se realizó una revisión narrativa de un libro universitario veterinario en español y de artículos originales y revisiones científicas consultados el 17 de octubre de 2026. Se priorizaron publicaciones de 2021 a 2025 y se incorporaron trabajos anteriores por su valor experimental o clínico. Se contrastaron mecanismos entre taxones, se verificaron autores y enlaces y se organizaron las referencias en estilo Vancouver. Esta síntesis no constituye una revisión sistemática.</w:t>
+        <w:t>Se realizó una revisión narrativa de materiales universitarios, recursos institucionales y artículos científicos. La consulta se actualizó el 19 de octubre de 2026. Se priorizó el capítulo veterinario de la UNAM en español y se contrastaron los mecanismos con publicaciones especializadas. Los documentos del grupo orientaron la secuencia temática. Se seleccionaron fuentes pertinentes para los tres ejes del trabajo y se organizaron las citas por orden de aparición en estilo Vancouver. Los ejemplos representan conocimientos bibliográficos, sin datos clínicos o experimentales obtenidos por el equipo.</w:t>
       </w:r>
     </w:p>
     <w:p>
@@ -214,7 +258,7 @@
         <w:pageBreakBefore/>
       </w:pPr>
       <w:r>
-        <w:t>4 Marco teórico</w:t>
+        <w:t>4 Cromosomas sexuales</w:t>
       </w:r>
     </w:p>
     <w:p>
@@ -222,17 +266,422 @@
         <w:pStyle w:val="Heading2"/>
       </w:pPr>
       <w:r>
-        <w:t>4.1 Cromosomas sexuales y niveles del desarrollo sexual</w:t>
+        <w:t>4.1 Definición e información genética</w:t>
       </w:r>
     </w:p>
     <w:p>
       <w:r>
-        <w:t>Los cromosomas sexuales son componentes del genoma cuya composición o dosis participa en la determinación del sexo en numerosos animales. Los demás cromosomas se denominan autosomas. Sin embargo, muchos genes que intervienen en el desarrollo gonadal se encuentran en autosomas; por ello, cromosoma sexual y gen relacionado con el sexo no son conceptos equivalentes. (1,2)</w:t>
+        <w:t>Un cromosoma es una estructura de ADN asociado a proteínas que organiza y transmite información hereditaria. Los cromosomas sexuales participan en la determinación del sexo dentro de un sistema biológico concreto. Los demás cromosomas se denominan autosomas. Esta distinción se refiere a su papel en el sistema de determinación sexual y no significa que toda la información sobre el desarrollo reproductivo se encuentre exclusivamente en X, Y, Z o W. (1,3)</w:t>
       </w:r>
     </w:p>
     <w:p>
       <w:r>
-        <w:t>En el patrón XX/XY, la hembra produce ovocitos con X, mientras que el macho produce espermatozoides con X o Y. La hembra es homogamética y el macho heterogamético. En las aves, el patrón se invierte: el macho ZZ produce gametos con Z y la hembra ZW produce gametos con Z o W. Homogametia y heterogametia describen los tipos de cromosomas sexuales presentes en los gametos, no una mayor o menor capacidad reproductiva. (1,4)</w:t>
+        <w:t xml:space="preserve">Los cromosomas sexuales también contienen genes con funciones ajenas a la determinación sexual. Un ejemplo histórico es la herencia del color ocular ligado al cromosoma X en </w:t>
+      </w:r>
+      <w:r>
+        <w:rPr>
+          <w:i/>
+        </w:rPr>
+        <w:t>Drosophila</w:t>
+      </w:r>
+      <w:r>
+        <w:t>. A su vez, genes autosómicos y regiones reguladoras participan en la diferenciación gonadal. (3,4)</w:t>
+      </w:r>
+    </w:p>
+    <w:p>
+      <w:pPr>
+        <w:pStyle w:val="Heading2"/>
+      </w:pPr>
+      <w:r>
+        <w:t>4.2 Cromosomas X e Y</w:t>
+      </w:r>
+    </w:p>
+    <w:p>
+      <w:r>
+        <w:t>En el modelo habitual de los mamíferos domésticos, las hembras presentan XX y los machos XY. X e Y difieren en su contenido génico. En numerosos mamíferos, el cromosoma Y contiene SRY, un gen que inicia una red de regulación favorable al desarrollo testicular. La función de SRY depende de su expresión en las células y en el momento apropiados, junto con otros componentes de la red. (2,4)</w:t>
+      </w:r>
+    </w:p>
+    <w:p>
+      <w:r>
+        <w:t>El gen SOX9 participa en la diferenciación de las células de Sertoli y en la organización del testículo. Su intervención muestra que la vía testicular depende de la coordinación de varios genes, algunos localizados fuera de los cromosomas sexuales. Las alteraciones de esta regulación pueden producir diferencias entre la constitución cromosómica y el desarrollo gonadal o anatómico. (4)</w:t>
+      </w:r>
+    </w:p>
+    <w:p>
+      <w:pPr>
+        <w:pStyle w:val="Heading2"/>
+      </w:pPr>
+      <w:r>
+        <w:t>4.3 Transmisión y tipos de gametos</w:t>
+      </w:r>
+    </w:p>
+    <w:p>
+      <w:r>
+        <w:t>Durante la formación de gametos se reduce el número de juegos cromosómicos. En el modelo XX/XY, los ovocitos aportan un X y los espermatozoides pueden aportar X o Y. La fecundación reúne las contribuciones de ambos progenitores. El término homogamético describe la producción de un solo tipo de gameto respecto a los cromosomas sexuales; heterogamético describe la producción de dos tipos. (2)</w:t>
+      </w:r>
+    </w:p>
+    <w:tbl>
+      <w:tblPr>
+        <w:tblW w:type="auto" w:w="0"/>
+        <w:jc w:val="center"/>
+        <w:tblLayout w:type="fixed"/>
+        <w:tblLook w:firstColumn="1" w:firstRow="1" w:lastColumn="0" w:lastRow="0" w:noHBand="0" w:noVBand="1" w:val="04A0"/>
+      </w:tblPr>
+      <w:tblGrid>
+        <w:gridCol w:w="1800"/>
+        <w:gridCol w:w="4608"/>
+        <w:gridCol w:w="2952"/>
+      </w:tblGrid>
+      <w:tr>
+        <w:trPr>
+          <w:cantSplit/>
+          <w:tblHeader/>
+        </w:trPr>
+        <w:tc>
+          <w:tcPr>
+            <w:tcW w:type="dxa" w:w="1800"/>
+            <w:vAlign w:val="center"/>
+            <w:tcBorders>
+              <w:top w:val="single" w:sz="5" w:color="D9D9D9"/>
+              <w:bottom w:val="single" w:sz="5" w:color="D9D9D9"/>
+              <w:left w:val="single" w:sz="5" w:color="D9D9D9"/>
+              <w:right w:val="single" w:sz="5" w:color="D9D9D9"/>
+            </w:tcBorders>
+            <w:shd w:fill="E7E7E7"/>
+            <w:tcMar>
+              <w:top w:w="90" w:type="dxa"/>
+              <w:bottom w:w="90" w:type="dxa"/>
+              <w:left w:w="90" w:type="dxa"/>
+              <w:right w:w="90" w:type="dxa"/>
+            </w:tcMar>
+          </w:tcPr>
+          <w:p>
+            <w:pPr>
+              <w:spacing w:after="40" w:before="40" w:line="252" w:lineRule="auto"/>
+              <w:jc w:val="left"/>
+            </w:pPr>
+            <w:r>
+              <w:rPr>
+                <w:b/>
+                <w:sz w:val="24"/>
+              </w:rPr>
+              <w:t>Concepto</w:t>
+            </w:r>
+          </w:p>
+        </w:tc>
+        <w:tc>
+          <w:tcPr>
+            <w:tcW w:type="dxa" w:w="4608"/>
+            <w:vAlign w:val="center"/>
+            <w:tcBorders>
+              <w:top w:val="single" w:sz="5" w:color="D9D9D9"/>
+              <w:bottom w:val="single" w:sz="5" w:color="D9D9D9"/>
+              <w:left w:val="single" w:sz="5" w:color="D9D9D9"/>
+              <w:right w:val="single" w:sz="5" w:color="D9D9D9"/>
+            </w:tcBorders>
+            <w:shd w:fill="E7E7E7"/>
+            <w:tcMar>
+              <w:top w:w="90" w:type="dxa"/>
+              <w:bottom w:w="90" w:type="dxa"/>
+              <w:left w:w="90" w:type="dxa"/>
+              <w:right w:w="90" w:type="dxa"/>
+            </w:tcMar>
+          </w:tcPr>
+          <w:p>
+            <w:pPr>
+              <w:spacing w:after="40" w:before="40" w:line="252" w:lineRule="auto"/>
+              <w:jc w:val="left"/>
+            </w:pPr>
+            <w:r>
+              <w:rPr>
+                <w:b/>
+                <w:sz w:val="24"/>
+              </w:rPr>
+              <w:t>Significado</w:t>
+            </w:r>
+          </w:p>
+        </w:tc>
+        <w:tc>
+          <w:tcPr>
+            <w:tcW w:type="dxa" w:w="2952"/>
+            <w:vAlign w:val="center"/>
+            <w:tcBorders>
+              <w:top w:val="single" w:sz="5" w:color="D9D9D9"/>
+              <w:bottom w:val="single" w:sz="5" w:color="D9D9D9"/>
+              <w:left w:val="single" w:sz="5" w:color="D9D9D9"/>
+              <w:right w:val="single" w:sz="5" w:color="D9D9D9"/>
+            </w:tcBorders>
+            <w:shd w:fill="E7E7E7"/>
+            <w:tcMar>
+              <w:top w:w="90" w:type="dxa"/>
+              <w:bottom w:w="90" w:type="dxa"/>
+              <w:left w:w="90" w:type="dxa"/>
+              <w:right w:w="90" w:type="dxa"/>
+            </w:tcMar>
+          </w:tcPr>
+          <w:p>
+            <w:pPr>
+              <w:spacing w:after="40" w:before="40" w:line="252" w:lineRule="auto"/>
+              <w:jc w:val="left"/>
+            </w:pPr>
+            <w:r>
+              <w:rPr>
+                <w:b/>
+                <w:sz w:val="24"/>
+              </w:rPr>
+              <w:t>Ejemplo</w:t>
+            </w:r>
+          </w:p>
+        </w:tc>
+      </w:tr>
+      <w:tr>
+        <w:trPr>
+          <w:cantSplit/>
+        </w:trPr>
+        <w:tc>
+          <w:tcPr>
+            <w:tcW w:type="dxa" w:w="1800"/>
+            <w:vAlign w:val="center"/>
+            <w:tcBorders>
+              <w:top w:val="single" w:sz="5" w:color="D9D9D9"/>
+              <w:bottom w:val="single" w:sz="5" w:color="D9D9D9"/>
+              <w:left w:val="single" w:sz="5" w:color="D9D9D9"/>
+              <w:right w:val="single" w:sz="5" w:color="D9D9D9"/>
+            </w:tcBorders>
+            <w:shd w:fill="FFFFFF"/>
+            <w:tcMar>
+              <w:top w:w="90" w:type="dxa"/>
+              <w:bottom w:w="90" w:type="dxa"/>
+              <w:left w:w="90" w:type="dxa"/>
+              <w:right w:w="90" w:type="dxa"/>
+            </w:tcMar>
+          </w:tcPr>
+          <w:p>
+            <w:pPr>
+              <w:spacing w:after="40" w:before="40" w:line="252" w:lineRule="auto"/>
+              <w:jc w:val="left"/>
+            </w:pPr>
+            <w:r>
+              <w:rPr>
+                <w:b w:val="0"/>
+                <w:sz w:val="24"/>
+              </w:rPr>
+              <w:t>Homogametia</w:t>
+            </w:r>
+          </w:p>
+        </w:tc>
+        <w:tc>
+          <w:tcPr>
+            <w:tcW w:type="dxa" w:w="4608"/>
+            <w:vAlign w:val="center"/>
+            <w:tcBorders>
+              <w:top w:val="single" w:sz="5" w:color="D9D9D9"/>
+              <w:bottom w:val="single" w:sz="5" w:color="D9D9D9"/>
+              <w:left w:val="single" w:sz="5" w:color="D9D9D9"/>
+              <w:right w:val="single" w:sz="5" w:color="D9D9D9"/>
+            </w:tcBorders>
+            <w:shd w:fill="FFFFFF"/>
+            <w:tcMar>
+              <w:top w:w="90" w:type="dxa"/>
+              <w:bottom w:w="90" w:type="dxa"/>
+              <w:left w:w="90" w:type="dxa"/>
+              <w:right w:w="90" w:type="dxa"/>
+            </w:tcMar>
+          </w:tcPr>
+          <w:p>
+            <w:pPr>
+              <w:spacing w:after="40" w:before="40" w:line="252" w:lineRule="auto"/>
+              <w:jc w:val="left"/>
+            </w:pPr>
+            <w:r>
+              <w:rPr>
+                <w:b w:val="0"/>
+                <w:sz w:val="24"/>
+              </w:rPr>
+              <w:t>Un tipo de gameto respecto al cromosoma sexual.</w:t>
+            </w:r>
+          </w:p>
+        </w:tc>
+        <w:tc>
+          <w:tcPr>
+            <w:tcW w:type="dxa" w:w="2952"/>
+            <w:vAlign w:val="center"/>
+            <w:tcBorders>
+              <w:top w:val="single" w:sz="5" w:color="D9D9D9"/>
+              <w:bottom w:val="single" w:sz="5" w:color="D9D9D9"/>
+              <w:left w:val="single" w:sz="5" w:color="D9D9D9"/>
+              <w:right w:val="single" w:sz="5" w:color="D9D9D9"/>
+            </w:tcBorders>
+            <w:shd w:fill="FFFFFF"/>
+            <w:tcMar>
+              <w:top w:w="90" w:type="dxa"/>
+              <w:bottom w:w="90" w:type="dxa"/>
+              <w:left w:w="90" w:type="dxa"/>
+              <w:right w:w="90" w:type="dxa"/>
+            </w:tcMar>
+          </w:tcPr>
+          <w:p>
+            <w:pPr>
+              <w:spacing w:after="40" w:before="40" w:line="252" w:lineRule="auto"/>
+              <w:jc w:val="left"/>
+            </w:pPr>
+            <w:r>
+              <w:rPr>
+                <w:b w:val="0"/>
+                <w:sz w:val="24"/>
+              </w:rPr>
+              <w:t>Hembra XX: gametos X.</w:t>
+            </w:r>
+          </w:p>
+        </w:tc>
+      </w:tr>
+      <w:tr>
+        <w:trPr>
+          <w:cantSplit/>
+        </w:trPr>
+        <w:tc>
+          <w:tcPr>
+            <w:tcW w:type="dxa" w:w="1800"/>
+            <w:vAlign w:val="center"/>
+            <w:tcBorders>
+              <w:top w:val="single" w:sz="5" w:color="D9D9D9"/>
+              <w:bottom w:val="single" w:sz="5" w:color="D9D9D9"/>
+              <w:left w:val="single" w:sz="5" w:color="D9D9D9"/>
+              <w:right w:val="single" w:sz="5" w:color="D9D9D9"/>
+            </w:tcBorders>
+            <w:shd w:fill="F7F7F7"/>
+            <w:tcMar>
+              <w:top w:w="90" w:type="dxa"/>
+              <w:bottom w:w="90" w:type="dxa"/>
+              <w:left w:w="90" w:type="dxa"/>
+              <w:right w:w="90" w:type="dxa"/>
+            </w:tcMar>
+          </w:tcPr>
+          <w:p>
+            <w:pPr>
+              <w:spacing w:after="40" w:before="40" w:line="252" w:lineRule="auto"/>
+              <w:jc w:val="left"/>
+            </w:pPr>
+            <w:r>
+              <w:rPr>
+                <w:b w:val="0"/>
+                <w:sz w:val="24"/>
+              </w:rPr>
+              <w:t>Heterogametia</w:t>
+            </w:r>
+          </w:p>
+        </w:tc>
+        <w:tc>
+          <w:tcPr>
+            <w:tcW w:type="dxa" w:w="4608"/>
+            <w:vAlign w:val="center"/>
+            <w:tcBorders>
+              <w:top w:val="single" w:sz="5" w:color="D9D9D9"/>
+              <w:bottom w:val="single" w:sz="5" w:color="D9D9D9"/>
+              <w:left w:val="single" w:sz="5" w:color="D9D9D9"/>
+              <w:right w:val="single" w:sz="5" w:color="D9D9D9"/>
+            </w:tcBorders>
+            <w:shd w:fill="F7F7F7"/>
+            <w:tcMar>
+              <w:top w:w="90" w:type="dxa"/>
+              <w:bottom w:w="90" w:type="dxa"/>
+              <w:left w:w="90" w:type="dxa"/>
+              <w:right w:w="90" w:type="dxa"/>
+            </w:tcMar>
+          </w:tcPr>
+          <w:p>
+            <w:pPr>
+              <w:spacing w:after="40" w:before="40" w:line="252" w:lineRule="auto"/>
+              <w:jc w:val="left"/>
+            </w:pPr>
+            <w:r>
+              <w:rPr>
+                <w:b w:val="0"/>
+                <w:sz w:val="24"/>
+              </w:rPr>
+              <w:t>Dos tipos de gameto respecto al cromosoma sexual.</w:t>
+            </w:r>
+          </w:p>
+        </w:tc>
+        <w:tc>
+          <w:tcPr>
+            <w:tcW w:type="dxa" w:w="2952"/>
+            <w:vAlign w:val="center"/>
+            <w:tcBorders>
+              <w:top w:val="single" w:sz="5" w:color="D9D9D9"/>
+              <w:bottom w:val="single" w:sz="5" w:color="D9D9D9"/>
+              <w:left w:val="single" w:sz="5" w:color="D9D9D9"/>
+              <w:right w:val="single" w:sz="5" w:color="D9D9D9"/>
+            </w:tcBorders>
+            <w:shd w:fill="F7F7F7"/>
+            <w:tcMar>
+              <w:top w:w="90" w:type="dxa"/>
+              <w:bottom w:w="90" w:type="dxa"/>
+              <w:left w:w="90" w:type="dxa"/>
+              <w:right w:w="90" w:type="dxa"/>
+            </w:tcMar>
+          </w:tcPr>
+          <w:p>
+            <w:pPr>
+              <w:spacing w:after="40" w:before="40" w:line="252" w:lineRule="auto"/>
+              <w:jc w:val="left"/>
+            </w:pPr>
+            <w:r>
+              <w:rPr>
+                <w:b w:val="0"/>
+                <w:sz w:val="24"/>
+              </w:rPr>
+              <w:t>Macho XY: gametos X o Y.</w:t>
+            </w:r>
+          </w:p>
+        </w:tc>
+      </w:tr>
+    </w:tbl>
+    <w:p>
+      <w:pPr>
+        <w:spacing w:after="0"/>
+      </w:pPr>
+    </w:p>
+    <w:p>
+      <w:pPr>
+        <w:pStyle w:val="Caption"/>
+      </w:pPr>
+      <w:r>
+        <w:t>Tabla 1. Homogametia y heterogametia en el modelo XX/XY. Elaboración propia. (2)</w:t>
+      </w:r>
+    </w:p>
+    <w:p>
+      <w:pPr>
+        <w:pStyle w:val="Heading1"/>
+        <w:pageBreakBefore/>
+      </w:pPr>
+      <w:r>
+        <w:t>5 Diferenciación sexual</w:t>
+      </w:r>
+    </w:p>
+    <w:p>
+      <w:pPr>
+        <w:pStyle w:val="Heading2"/>
+      </w:pPr>
+      <w:r>
+        <w:t>5.1 Determinación y diferenciación</w:t>
+      </w:r>
+    </w:p>
+    <w:p>
+      <w:r>
+        <w:t>La determinación sexual comprende los mecanismos que orientan la vía de desarrollo sexual de un individuo. La diferenciación sexual es el conjunto de procesos mediante los cuales se forman y especializan las gónadas, los conductos reproductores y los genitales. Ambos procesos están relacionados, pero el establecimiento de una señal inicial no equivale por sí mismo a la formación completa de los órganos. (2,4)</w:t>
+      </w:r>
+    </w:p>
+    <w:p>
+      <w:pPr>
+        <w:pStyle w:val="Heading2"/>
+      </w:pPr>
+      <w:r>
+        <w:t>5.2 Cuatro niveles del desarrollo</w:t>
+      </w:r>
+    </w:p>
+    <w:p>
+      <w:r>
+        <w:t>El nivel cromosómico corresponde a la constitución genética sexual. El nivel gonadal describe la organización ovárica o testicular. El hormonal considera las señales producidas y su recepción en los tejidos. El fenotípico expresa los resultados anatómicos, incluidos órganos internos y genitales externos. Estos niveles son dimensiones relacionadas del desarrollo y no cuatro momentos independientes. (2)</w:t>
       </w:r>
     </w:p>
     <w:p>
@@ -243,8 +692,8 @@
       <w:r>
         <w:drawing>
           <wp:inline xmlns:a="http://schemas.openxmlformats.org/drawingml/2006/main" xmlns:pic="http://schemas.openxmlformats.org/drawingml/2006/picture">
-            <wp:extent cx="5760720" cy="2455101"/>
-            <wp:docPr id="1" name="Picture 1" descr="Figura 1. Cruces cromosómicos simplificados de mamíferos domésticos y aves. Las combinaciones ilustran probabilidades teóricas bajo segregación y fecundación equivalentes; no garantizan una proporción exacta en una camada. Elaboración propia. (1,7)"/>
+            <wp:extent cx="5715000" cy="2079489"/>
+            <wp:docPr id="1" name="Picture 1" descr="Figura 1. Cuatro niveles del desarrollo sexual en el modelo mamífero. Elaboración propia con base en la UNAM. "/>
             <wp:cNvGraphicFramePr>
               <a:graphicFrameLocks noChangeAspect="1"/>
             </wp:cNvGraphicFramePr>
@@ -252,7 +701,7 @@
               <a:graphicData uri="http://schemas.openxmlformats.org/drawingml/2006/picture">
                 <pic:pic>
                   <pic:nvPicPr>
-                    <pic:cNvPr id="0" name="figura_1_cruces.png"/>
+                    <pic:cNvPr id="0" name="niveles.png"/>
                     <pic:cNvPicPr/>
                   </pic:nvPicPr>
                   <pic:blipFill>
@@ -264,7 +713,7 @@
                   <pic:spPr>
                     <a:xfrm>
                       <a:off x="0" y="0"/>
-                      <a:ext cx="5760720" cy="2455101"/>
+                      <a:ext cx="5715000" cy="2079489"/>
                     </a:xfrm>
                     <a:prstGeom prst="rect"/>
                   </pic:spPr>
@@ -281,7 +730,44 @@
         <w:keepLines/>
       </w:pPr>
       <w:r>
-        <w:t>Figura 1. Cruces cromosómicos simplificados de mamíferos domésticos y aves. Las combinaciones ilustran probabilidades teóricas bajo segregación y fecundación equivalentes; no garantizan una proporción exacta en una camada. Elaboración propia. (1,4)</w:t>
+        <w:t>Figura 1. Cuatro niveles del desarrollo sexual en el modelo mamífero. Elaboración propia con base en la UNAM. (2)</w:t>
+      </w:r>
+    </w:p>
+    <w:p>
+      <w:pPr>
+        <w:pStyle w:val="Heading2"/>
+      </w:pPr>
+      <w:r>
+        <w:t>5.3 Gónada bipotencial y redes de regulación</w:t>
+      </w:r>
+    </w:p>
+    <w:p>
+      <w:r>
+        <w:t>Al inicio, el primordio gonadal puede organizarse hacia testículo u ovario. Sus células somáticas y las células germinales constituyen linajes distintos: las germinales originarán la línea de los gametos, mientras que las somáticas participan en el soporte y la organización del órgano. Las células germinales no se convierten en células de Sertoli o Leydig. (2)</w:t>
+      </w:r>
+    </w:p>
+    <w:p>
+      <w:r>
+        <w:t>En la vía testicular típica, SRY favorece la actividad de SOX9 y la diferenciación de las células de Sertoli. En la vía ovárica participan redes como WNT4/RSPO1/β-catenina y FOXL2. Estas redes interactúan y sus funciones varían entre especies y etapas. El ovario requiere un programa de desarrollo activo; su formación no puede reducirse a una falta de actividad genética. (4,5)</w:t>
+      </w:r>
+    </w:p>
+    <w:p>
+      <w:pPr>
+        <w:pStyle w:val="Heading2"/>
+        <w:pageBreakBefore/>
+      </w:pPr>
+      <w:r>
+        <w:t>5.4 Desarrollo del aparato reproductor masculino</w:t>
+      </w:r>
+    </w:p>
+    <w:p>
+      <w:r>
+        <w:t>El testículo fetal produce señales que actúan sobre distintos tejidos. Las células de Sertoli secretan hormona antimülleriana (AMH), que interviene en la regresión de los conductos de Müller. Las células de Leydig producen testosterona, que favorece el mantenimiento y la diferenciación de los conductos de Wolff. En tejidos diana, la enzima 5α-reductasa convierte testosterona en dihidrotestosterona (DHT), importante para el desarrollo de los genitales externos masculinos y la próstata. (2)</w:t>
+      </w:r>
+    </w:p>
+    <w:p>
+      <w:r>
+        <w:t>La función endocrina del testículo fetal debe distinguirse de la producción de espermatozoides propia de etapas posteriores. En el embrión se organizan los tejidos y se producen señales del desarrollo; no se representa una espermatogénesis madura. (2)</w:t>
       </w:r>
     </w:p>
     <w:tbl>
@@ -292,8 +778,9 @@
         <w:tblLook w:firstColumn="1" w:firstRow="1" w:lastColumn="0" w:lastRow="0" w:noHBand="0" w:noVBand="1" w:val="04A0"/>
       </w:tblPr>
       <w:tblGrid>
-        <w:gridCol w:w="1944"/>
-        <w:gridCol w:w="7344"/>
+        <w:gridCol w:w="1584"/>
+        <w:gridCol w:w="3096"/>
+        <w:gridCol w:w="4680"/>
       </w:tblGrid>
       <w:tr>
         <w:trPr>
@@ -302,25 +789,25 @@
         </w:trPr>
         <w:tc>
           <w:tcPr>
-            <w:tcW w:type="dxa" w:w="1944"/>
+            <w:tcW w:type="dxa" w:w="1584"/>
             <w:vAlign w:val="center"/>
             <w:tcBorders>
               <w:top w:val="single" w:sz="5" w:color="D9D9D9"/>
+              <w:bottom w:val="single" w:sz="5" w:color="D9D9D9"/>
               <w:left w:val="single" w:sz="5" w:color="D9D9D9"/>
-              <w:bottom w:val="single" w:sz="5" w:color="D9D9D9"/>
               <w:right w:val="single" w:sz="5" w:color="D9D9D9"/>
             </w:tcBorders>
-            <w:shd w:fill="E5E5E5"/>
+            <w:shd w:fill="E7E7E7"/>
             <w:tcMar>
               <w:top w:w="90" w:type="dxa"/>
+              <w:bottom w:w="90" w:type="dxa"/>
               <w:left w:w="90" w:type="dxa"/>
-              <w:bottom w:w="90" w:type="dxa"/>
               <w:right w:w="90" w:type="dxa"/>
             </w:tcMar>
           </w:tcPr>
           <w:p>
             <w:pPr>
-              <w:spacing w:line="252" w:lineRule="auto" w:after="40" w:before="40"/>
+              <w:spacing w:after="40" w:before="40" w:line="252" w:lineRule="auto"/>
               <w:jc w:val="left"/>
             </w:pPr>
             <w:r>
@@ -328,31 +815,31 @@
                 <w:b/>
                 <w:sz w:val="24"/>
               </w:rPr>
-              <w:t>Nivel</w:t>
+              <w:t>Señal</w:t>
             </w:r>
           </w:p>
         </w:tc>
         <w:tc>
           <w:tcPr>
-            <w:tcW w:type="dxa" w:w="7344"/>
+            <w:tcW w:type="dxa" w:w="3096"/>
             <w:vAlign w:val="center"/>
             <w:tcBorders>
               <w:top w:val="single" w:sz="5" w:color="D9D9D9"/>
+              <w:bottom w:val="single" w:sz="5" w:color="D9D9D9"/>
               <w:left w:val="single" w:sz="5" w:color="D9D9D9"/>
-              <w:bottom w:val="single" w:sz="5" w:color="D9D9D9"/>
               <w:right w:val="single" w:sz="5" w:color="D9D9D9"/>
             </w:tcBorders>
-            <w:shd w:fill="E5E5E5"/>
+            <w:shd w:fill="E7E7E7"/>
             <w:tcMar>
               <w:top w:w="90" w:type="dxa"/>
+              <w:bottom w:w="90" w:type="dxa"/>
               <w:left w:w="90" w:type="dxa"/>
-              <w:bottom w:w="90" w:type="dxa"/>
               <w:right w:w="90" w:type="dxa"/>
             </w:tcMar>
           </w:tcPr>
           <w:p>
             <w:pPr>
-              <w:spacing w:line="252" w:lineRule="auto" w:after="40" w:before="40"/>
+              <w:spacing w:after="40" w:before="40" w:line="252" w:lineRule="auto"/>
               <w:jc w:val="left"/>
             </w:pPr>
             <w:r>
@@ -360,7 +847,39 @@
                 <w:b/>
                 <w:sz w:val="24"/>
               </w:rPr>
-              <w:t>Qué describe</w:t>
+              <w:t>Origen o formación</w:t>
+            </w:r>
+          </w:p>
+        </w:tc>
+        <w:tc>
+          <w:tcPr>
+            <w:tcW w:type="dxa" w:w="4680"/>
+            <w:vAlign w:val="center"/>
+            <w:tcBorders>
+              <w:top w:val="single" w:sz="5" w:color="D9D9D9"/>
+              <w:bottom w:val="single" w:sz="5" w:color="D9D9D9"/>
+              <w:left w:val="single" w:sz="5" w:color="D9D9D9"/>
+              <w:right w:val="single" w:sz="5" w:color="D9D9D9"/>
+            </w:tcBorders>
+            <w:shd w:fill="E7E7E7"/>
+            <w:tcMar>
+              <w:top w:w="90" w:type="dxa"/>
+              <w:bottom w:w="90" w:type="dxa"/>
+              <w:left w:w="90" w:type="dxa"/>
+              <w:right w:w="90" w:type="dxa"/>
+            </w:tcMar>
+          </w:tcPr>
+          <w:p>
+            <w:pPr>
+              <w:spacing w:after="40" w:before="40" w:line="252" w:lineRule="auto"/>
+              <w:jc w:val="left"/>
+            </w:pPr>
+            <w:r>
+              <w:rPr>
+                <w:b/>
+                <w:sz w:val="24"/>
+              </w:rPr>
+              <w:t>Efecto principal en el modelo mamífero</w:t>
             </w:r>
           </w:p>
         </w:tc>
@@ -371,25 +890,25 @@
         </w:trPr>
         <w:tc>
           <w:tcPr>
-            <w:tcW w:type="dxa" w:w="1944"/>
+            <w:tcW w:type="dxa" w:w="1584"/>
             <w:vAlign w:val="center"/>
             <w:tcBorders>
               <w:top w:val="single" w:sz="5" w:color="D9D9D9"/>
+              <w:bottom w:val="single" w:sz="5" w:color="D9D9D9"/>
               <w:left w:val="single" w:sz="5" w:color="D9D9D9"/>
-              <w:bottom w:val="single" w:sz="5" w:color="D9D9D9"/>
               <w:right w:val="single" w:sz="5" w:color="D9D9D9"/>
             </w:tcBorders>
             <w:shd w:fill="FFFFFF"/>
             <w:tcMar>
               <w:top w:w="90" w:type="dxa"/>
+              <w:bottom w:w="90" w:type="dxa"/>
               <w:left w:w="90" w:type="dxa"/>
-              <w:bottom w:w="90" w:type="dxa"/>
               <w:right w:w="90" w:type="dxa"/>
             </w:tcMar>
           </w:tcPr>
           <w:p>
             <w:pPr>
-              <w:spacing w:line="252" w:lineRule="auto" w:after="40" w:before="40"/>
+              <w:spacing w:after="40" w:before="40" w:line="252" w:lineRule="auto"/>
               <w:jc w:val="left"/>
             </w:pPr>
             <w:r>
@@ -397,31 +916,31 @@
                 <w:b w:val="0"/>
                 <w:sz w:val="24"/>
               </w:rPr>
-              <w:t>Cromosómico</w:t>
+              <w:t>AMH</w:t>
             </w:r>
           </w:p>
         </w:tc>
         <w:tc>
           <w:tcPr>
-            <w:tcW w:type="dxa" w:w="7344"/>
+            <w:tcW w:type="dxa" w:w="3096"/>
             <w:vAlign w:val="center"/>
             <w:tcBorders>
               <w:top w:val="single" w:sz="5" w:color="D9D9D9"/>
+              <w:bottom w:val="single" w:sz="5" w:color="D9D9D9"/>
               <w:left w:val="single" w:sz="5" w:color="D9D9D9"/>
-              <w:bottom w:val="single" w:sz="5" w:color="D9D9D9"/>
               <w:right w:val="single" w:sz="5" w:color="D9D9D9"/>
             </w:tcBorders>
             <w:shd w:fill="FFFFFF"/>
             <w:tcMar>
               <w:top w:w="90" w:type="dxa"/>
+              <w:bottom w:w="90" w:type="dxa"/>
               <w:left w:w="90" w:type="dxa"/>
-              <w:bottom w:w="90" w:type="dxa"/>
               <w:right w:w="90" w:type="dxa"/>
             </w:tcMar>
           </w:tcPr>
           <w:p>
             <w:pPr>
-              <w:spacing w:line="252" w:lineRule="auto" w:after="40" w:before="40"/>
+              <w:spacing w:after="40" w:before="40" w:line="252" w:lineRule="auto"/>
               <w:jc w:val="left"/>
             </w:pPr>
             <w:r>
@@ -429,7 +948,39 @@
                 <w:b w:val="0"/>
                 <w:sz w:val="24"/>
               </w:rPr>
-              <w:t>Constitución de cromosomas sexuales del individuo.</w:t>
+              <w:t>Células de Sertoli fetales.</w:t>
+            </w:r>
+          </w:p>
+        </w:tc>
+        <w:tc>
+          <w:tcPr>
+            <w:tcW w:type="dxa" w:w="4680"/>
+            <w:vAlign w:val="center"/>
+            <w:tcBorders>
+              <w:top w:val="single" w:sz="5" w:color="D9D9D9"/>
+              <w:bottom w:val="single" w:sz="5" w:color="D9D9D9"/>
+              <w:left w:val="single" w:sz="5" w:color="D9D9D9"/>
+              <w:right w:val="single" w:sz="5" w:color="D9D9D9"/>
+            </w:tcBorders>
+            <w:shd w:fill="FFFFFF"/>
+            <w:tcMar>
+              <w:top w:w="90" w:type="dxa"/>
+              <w:bottom w:w="90" w:type="dxa"/>
+              <w:left w:w="90" w:type="dxa"/>
+              <w:right w:w="90" w:type="dxa"/>
+            </w:tcMar>
+          </w:tcPr>
+          <w:p>
+            <w:pPr>
+              <w:spacing w:after="40" w:before="40" w:line="252" w:lineRule="auto"/>
+              <w:jc w:val="left"/>
+            </w:pPr>
+            <w:r>
+              <w:rPr>
+                <w:b w:val="0"/>
+                <w:sz w:val="24"/>
+              </w:rPr>
+              <w:t>Regresión de los conductos de Müller.</w:t>
             </w:r>
           </w:p>
         </w:tc>
@@ -440,25 +991,25 @@
         </w:trPr>
         <w:tc>
           <w:tcPr>
-            <w:tcW w:type="dxa" w:w="1944"/>
+            <w:tcW w:type="dxa" w:w="1584"/>
             <w:vAlign w:val="center"/>
             <w:tcBorders>
               <w:top w:val="single" w:sz="5" w:color="D9D9D9"/>
+              <w:bottom w:val="single" w:sz="5" w:color="D9D9D9"/>
               <w:left w:val="single" w:sz="5" w:color="D9D9D9"/>
-              <w:bottom w:val="single" w:sz="5" w:color="D9D9D9"/>
               <w:right w:val="single" w:sz="5" w:color="D9D9D9"/>
             </w:tcBorders>
-            <w:shd w:fill="FFFFFF"/>
+            <w:shd w:fill="F7F7F7"/>
             <w:tcMar>
               <w:top w:w="90" w:type="dxa"/>
+              <w:bottom w:w="90" w:type="dxa"/>
               <w:left w:w="90" w:type="dxa"/>
-              <w:bottom w:w="90" w:type="dxa"/>
               <w:right w:w="90" w:type="dxa"/>
             </w:tcMar>
           </w:tcPr>
           <w:p>
             <w:pPr>
-              <w:spacing w:line="252" w:lineRule="auto" w:after="40" w:before="40"/>
+              <w:spacing w:after="40" w:before="40" w:line="252" w:lineRule="auto"/>
               <w:jc w:val="left"/>
             </w:pPr>
             <w:r>
@@ -466,31 +1017,31 @@
                 <w:b w:val="0"/>
                 <w:sz w:val="24"/>
               </w:rPr>
-              <w:t>Gonadal</w:t>
+              <w:t>Testosterona</w:t>
             </w:r>
           </w:p>
         </w:tc>
         <w:tc>
           <w:tcPr>
-            <w:tcW w:type="dxa" w:w="7344"/>
+            <w:tcW w:type="dxa" w:w="3096"/>
             <w:vAlign w:val="center"/>
             <w:tcBorders>
               <w:top w:val="single" w:sz="5" w:color="D9D9D9"/>
+              <w:bottom w:val="single" w:sz="5" w:color="D9D9D9"/>
               <w:left w:val="single" w:sz="5" w:color="D9D9D9"/>
-              <w:bottom w:val="single" w:sz="5" w:color="D9D9D9"/>
               <w:right w:val="single" w:sz="5" w:color="D9D9D9"/>
             </w:tcBorders>
-            <w:shd w:fill="FFFFFF"/>
+            <w:shd w:fill="F7F7F7"/>
             <w:tcMar>
               <w:top w:w="90" w:type="dxa"/>
+              <w:bottom w:w="90" w:type="dxa"/>
               <w:left w:w="90" w:type="dxa"/>
-              <w:bottom w:w="90" w:type="dxa"/>
               <w:right w:w="90" w:type="dxa"/>
             </w:tcMar>
           </w:tcPr>
           <w:p>
             <w:pPr>
-              <w:spacing w:line="252" w:lineRule="auto" w:after="40" w:before="40"/>
+              <w:spacing w:after="40" w:before="40" w:line="252" w:lineRule="auto"/>
               <w:jc w:val="left"/>
             </w:pPr>
             <w:r>
@@ -498,7 +1049,39 @@
                 <w:b w:val="0"/>
                 <w:sz w:val="24"/>
               </w:rPr>
-              <w:t>Organización y diferenciación de la gónada.</w:t>
+              <w:t>Células de Leydig fetales.</w:t>
+            </w:r>
+          </w:p>
+        </w:tc>
+        <w:tc>
+          <w:tcPr>
+            <w:tcW w:type="dxa" w:w="4680"/>
+            <w:vAlign w:val="center"/>
+            <w:tcBorders>
+              <w:top w:val="single" w:sz="5" w:color="D9D9D9"/>
+              <w:bottom w:val="single" w:sz="5" w:color="D9D9D9"/>
+              <w:left w:val="single" w:sz="5" w:color="D9D9D9"/>
+              <w:right w:val="single" w:sz="5" w:color="D9D9D9"/>
+            </w:tcBorders>
+            <w:shd w:fill="F7F7F7"/>
+            <w:tcMar>
+              <w:top w:w="90" w:type="dxa"/>
+              <w:bottom w:w="90" w:type="dxa"/>
+              <w:left w:w="90" w:type="dxa"/>
+              <w:right w:w="90" w:type="dxa"/>
+            </w:tcMar>
+          </w:tcPr>
+          <w:p>
+            <w:pPr>
+              <w:spacing w:after="40" w:before="40" w:line="252" w:lineRule="auto"/>
+              <w:jc w:val="left"/>
+            </w:pPr>
+            <w:r>
+              <w:rPr>
+                <w:b w:val="0"/>
+                <w:sz w:val="24"/>
+              </w:rPr>
+              <w:t>Mantenimiento y diferenciación de Wolff; derivados como epidídimo y conducto deferente.</w:t>
             </w:r>
           </w:p>
         </w:tc>
@@ -509,25 +1092,25 @@
         </w:trPr>
         <w:tc>
           <w:tcPr>
-            <w:tcW w:type="dxa" w:w="1944"/>
+            <w:tcW w:type="dxa" w:w="1584"/>
             <w:vAlign w:val="center"/>
             <w:tcBorders>
               <w:top w:val="single" w:sz="5" w:color="D9D9D9"/>
+              <w:bottom w:val="single" w:sz="5" w:color="D9D9D9"/>
               <w:left w:val="single" w:sz="5" w:color="D9D9D9"/>
-              <w:bottom w:val="single" w:sz="5" w:color="D9D9D9"/>
               <w:right w:val="single" w:sz="5" w:color="D9D9D9"/>
             </w:tcBorders>
             <w:shd w:fill="FFFFFF"/>
             <w:tcMar>
               <w:top w:w="90" w:type="dxa"/>
+              <w:bottom w:w="90" w:type="dxa"/>
               <w:left w:w="90" w:type="dxa"/>
-              <w:bottom w:w="90" w:type="dxa"/>
               <w:right w:w="90" w:type="dxa"/>
             </w:tcMar>
           </w:tcPr>
           <w:p>
             <w:pPr>
-              <w:spacing w:line="252" w:lineRule="auto" w:after="40" w:before="40"/>
+              <w:spacing w:after="40" w:before="40" w:line="252" w:lineRule="auto"/>
               <w:jc w:val="left"/>
             </w:pPr>
             <w:r>
@@ -535,31 +1118,31 @@
                 <w:b w:val="0"/>
                 <w:sz w:val="24"/>
               </w:rPr>
-              <w:t>Fenotípico</w:t>
+              <w:t>DHT</w:t>
             </w:r>
           </w:p>
         </w:tc>
         <w:tc>
           <w:tcPr>
-            <w:tcW w:type="dxa" w:w="7344"/>
+            <w:tcW w:type="dxa" w:w="3096"/>
             <w:vAlign w:val="center"/>
             <w:tcBorders>
               <w:top w:val="single" w:sz="5" w:color="D9D9D9"/>
+              <w:bottom w:val="single" w:sz="5" w:color="D9D9D9"/>
               <w:left w:val="single" w:sz="5" w:color="D9D9D9"/>
-              <w:bottom w:val="single" w:sz="5" w:color="D9D9D9"/>
               <w:right w:val="single" w:sz="5" w:color="D9D9D9"/>
             </w:tcBorders>
             <w:shd w:fill="FFFFFF"/>
             <w:tcMar>
               <w:top w:w="90" w:type="dxa"/>
+              <w:bottom w:w="90" w:type="dxa"/>
               <w:left w:w="90" w:type="dxa"/>
-              <w:bottom w:w="90" w:type="dxa"/>
               <w:right w:w="90" w:type="dxa"/>
             </w:tcMar>
           </w:tcPr>
           <w:p>
             <w:pPr>
-              <w:spacing w:line="252" w:lineRule="auto" w:after="40" w:before="40"/>
+              <w:spacing w:after="40" w:before="40" w:line="252" w:lineRule="auto"/>
               <w:jc w:val="left"/>
             </w:pPr>
             <w:r>
@@ -567,15 +1150,78 @@
                 <w:b w:val="0"/>
                 <w:sz w:val="24"/>
               </w:rPr>
-              <w:t>Características del tracto reproductor y de los genitales externos.</w:t>
+              <w:t>Conversión local de testosterona por 5α-reductasa.</w:t>
+            </w:r>
+          </w:p>
+        </w:tc>
+        <w:tc>
+          <w:tcPr>
+            <w:tcW w:type="dxa" w:w="4680"/>
+            <w:vAlign w:val="center"/>
+            <w:tcBorders>
+              <w:top w:val="single" w:sz="5" w:color="D9D9D9"/>
+              <w:bottom w:val="single" w:sz="5" w:color="D9D9D9"/>
+              <w:left w:val="single" w:sz="5" w:color="D9D9D9"/>
+              <w:right w:val="single" w:sz="5" w:color="D9D9D9"/>
+            </w:tcBorders>
+            <w:shd w:fill="FFFFFF"/>
+            <w:tcMar>
+              <w:top w:w="90" w:type="dxa"/>
+              <w:bottom w:w="90" w:type="dxa"/>
+              <w:left w:w="90" w:type="dxa"/>
+              <w:right w:w="90" w:type="dxa"/>
+            </w:tcMar>
+          </w:tcPr>
+          <w:p>
+            <w:pPr>
+              <w:spacing w:after="40" w:before="40" w:line="252" w:lineRule="auto"/>
+              <w:jc w:val="left"/>
+            </w:pPr>
+            <w:r>
+              <w:rPr>
+                <w:b w:val="0"/>
+                <w:sz w:val="24"/>
+              </w:rPr>
+              <w:t>Diferenciación de genitales externos masculinos y próstata.</w:t>
             </w:r>
           </w:p>
         </w:tc>
       </w:tr>
     </w:tbl>
     <w:p>
+      <w:pPr>
+        <w:spacing w:after="0"/>
+      </w:pPr>
+    </w:p>
+    <w:p>
+      <w:pPr>
+        <w:pStyle w:val="Caption"/>
+      </w:pPr>
       <w:r>
-        <w:t>La determinación gonadal corresponde a la elección inicial de una vía de desarrollo. La diferenciación sexual incluye los cambios posteriores en tejidos y órganos. El fenotipo externo, por sí solo, no permite asegurar la constitución cromosómica ni la estructura de las gónadas. (1,2)</w:t>
+        <w:t>Tabla 2. Origen y acción de las principales señales del desarrollo masculino. Elaboración propia con base en la UNAM. (2)</w:t>
+      </w:r>
+    </w:p>
+    <w:p>
+      <w:pPr>
+        <w:pStyle w:val="Heading2"/>
+      </w:pPr>
+      <w:r>
+        <w:t>5.5 Desarrollo del aparato reproductor femenino</w:t>
+      </w:r>
+    </w:p>
+    <w:p>
+      <w:r>
+        <w:t>La diferenciación ovárica implica la actividad de genes y señales que favorecen la organización del ovario y de sus células somáticas de soporte. WNT4, RSPO1, β-catenina y FOXL2 participan en este proceso, aunque no constituyen una secuencia única e idéntica en todos los animales. (5)</w:t>
+      </w:r>
+    </w:p>
+    <w:p>
+      <w:r>
+        <w:t>En el desarrollo femenino típico de los mamíferos, la ausencia de la señal testicular fetal de AMH permite la persistencia de los conductos de Müller. De ellos derivan estructuras como oviductos, útero y cuello uterino, con particularidades según la especie. La ausencia del estímulo androgénico testicular favorece la regresión de Wolff y el desarrollo externo femenino típico. Los ovarios y todos los genitales no proceden de Müller. (2)</w:t>
+      </w:r>
+    </w:p>
+    <w:p>
+      <w:r>
+        <w:t>La formación embrionaria del aparato reproductor debe separarse de la maduración puberal. En la pubertad, las hormonas ováricas participan en la maduración sexual y el establecimiento de la actividad cíclica. Por ello, no resulta correcto explicar la diferenciación fetal femenina simplemente como consecuencia de la secreción de estrógenos por un ovario ya maduro. (2,5)</w:t>
       </w:r>
     </w:p>
     <w:p>
@@ -584,22 +1230,12 @@
         <w:pageBreakBefore/>
       </w:pPr>
       <w:r>
-        <w:t>4.2 Determinación gonadal en mamíferos</w:t>
+        <w:t>5.6 Freemartinismo bovino</w:t>
       </w:r>
     </w:p>
     <w:p>
       <w:r>
-        <w:t>La gónada embrionaria se origina en las crestas genitales y al principio es bipotencial. Contiene células somáticas de soporte y recibe células germinales primordiales, precursoras de los gametos. La interacción entre estas poblaciones permite establecer la arquitectura gonadal. La cronología exacta varía entre especies; las semanas descritas para humanos no deben trasladarse a bovinos o perros. (1)</w:t>
-      </w:r>
-    </w:p>
-    <w:p>
-      <w:r>
-        <w:t>En el desarrollo testicular habitual, SRY actúa como factor de transcripción y favorece la elevación de SOX9 en las células precursoras de Sertoli. Estas células organizan los cordones testiculares y coordinan otras poblaciones gonadales. La regulación depende del momento y del nivel de expresión de los genes, además de sus regiones reguladoras; la simple presencia de una secuencia genética no resume todo el proceso. (2,5)</w:t>
-      </w:r>
-    </w:p>
-    <w:p>
-      <w:r>
-        <w:t>La vía ovárica también requiere regulación activa. RSPO1 y WNT4 favorecen la señalización por β-catenina, mientras que FOXL2 participa en la diferenciación y el mantenimiento de la identidad ovárica. Estas redes se oponen funcionalmente a componentes de la vía testicular. Su importancia relativa y su organización cambian entre especies, por lo que un esquema general no representa cada detalle del desarrollo de todos los vertebrados. (6)</w:t>
+        <w:t>El freemartinismo permite relacionar el desarrollo sexual con un ejemplo bovino. Puede presentarse en una hembra que comparte una gestación gemelar con un macho cuando se establecen comunicaciones vasculares entre sus placentas. Estas conexiones permiten el intercambio de células y señales durante el desarrollo fetal y pueden alterar la diferenciación del aparato reproductor de la hembra. (6)</w:t>
       </w:r>
     </w:p>
     <w:p>
@@ -610,8 +1246,8 @@
       <w:r>
         <w:drawing>
           <wp:inline xmlns:a="http://schemas.openxmlformats.org/drawingml/2006/main" xmlns:pic="http://schemas.openxmlformats.org/drawingml/2006/picture">
-            <wp:extent cx="5760720" cy="2319996"/>
-            <wp:docPr id="2" name="Picture 2" descr="Figura 2. Esquema simplificado de las redes de determinación gonadal en mamíferos. Las flechas representan una secuencia funcional, no todas las interacciones moleculares. Elaboración propia. (2,4,5)"/>
+            <wp:extent cx="5715000" cy="2137013"/>
+            <wp:docPr id="2" name="Picture 2" descr="Figura 2. Relación entre gestación gemelar, conexión vascular e intercambio fetal. El esquema representa un mecanismo posible, no un diagnóstico de todas las terneras cogemelas. Elaboración propia. "/>
             <wp:cNvGraphicFramePr>
               <a:graphicFrameLocks noChangeAspect="1"/>
             </wp:cNvGraphicFramePr>
@@ -619,7 +1255,7 @@
               <a:graphicData uri="http://schemas.openxmlformats.org/drawingml/2006/picture">
                 <pic:pic>
                   <pic:nvPicPr>
-                    <pic:cNvPr id="0" name="figura_2_redes.png"/>
+                    <pic:cNvPr id="0" name="freemartinismo.png"/>
                     <pic:cNvPicPr/>
                   </pic:nvPicPr>
                   <pic:blipFill>
@@ -631,7 +1267,7 @@
                   <pic:spPr>
                     <a:xfrm>
                       <a:off x="0" y="0"/>
-                      <a:ext cx="5760720" cy="2319996"/>
+                      <a:ext cx="5715000" cy="2137013"/>
                     </a:xfrm>
                     <a:prstGeom prst="rect"/>
                   </pic:spPr>
@@ -648,12 +1284,38 @@
         <w:keepLines/>
       </w:pPr>
       <w:r>
-        <w:t>Figura 2. Esquema simplificado de las redes de determinación gonadal en mamíferos. Las flechas representan una secuencia funcional, no todas las interacciones moleculares. Elaboración propia. (2,5,6)</w:t>
+        <w:t>Figura 2. Relación entre gestación gemelar, conexión vascular e intercambio fetal. El esquema representa un mecanismo posible, no un diagnóstico de todas las terneras cogemelas. Elaboración propia. (6)</w:t>
       </w:r>
     </w:p>
     <w:p>
       <w:r>
-        <w:t>La identidad gonadal necesita mantenimiento. En un experimento en ratones adultos, la eliminación de Foxl2 permitió la reprogramación de células ováricas hacia características testiculares. Este hallazgo demuestra regulación activa persistente, pero no significa que las hembras domésticas cambien espontáneamente de sexo en condiciones normales. (7)</w:t>
+        <w:t>El quimerismo sanguíneo XX/XY describe la coexistencia de poblaciones celulares con diferente constitución cromosómica. No significa que todas las células de la hembra cambien de XX a XY. Las alteraciones reproductivas pueden acompañarse de una capacidad reproductiva muy reducida o infertilidad. El antecedente de un cogemelo macho orienta la sospecha, pero la valoración del animal y las pruebas pertinentes permiten establecer su condición. (6)</w:t>
+      </w:r>
+    </w:p>
+    <w:p>
+      <w:r>
+        <w:t>La explicación del ejemplo puede seguir tres relaciones: primero, dos fetos comparten una gestación; después, una conexión vascular permite el intercambio; finalmente, las células y señales transferidas pueden afectar el desarrollo reproductivo de la hembra. Así se comprende la asociación sin atribuirla a una transformación de todos sus cromosomas. (6)</w:t>
+      </w:r>
+    </w:p>
+    <w:p>
+      <w:pPr>
+        <w:pStyle w:val="Heading1"/>
+      </w:pPr>
+      <w:r>
+        <w:t>6 Sistemas de determinación sexual</w:t>
+      </w:r>
+    </w:p>
+    <w:p>
+      <w:pPr>
+        <w:pStyle w:val="Heading2"/>
+      </w:pPr>
+      <w:r>
+        <w:t>6.1 Concepto y comparación</w:t>
+      </w:r>
+    </w:p>
+    <w:p>
+      <w:r>
+        <w:t>Los sistemas de determinación sexual son los mecanismos que establecen una dirección de desarrollo sexual. La variable relevante puede ser la combinación de cromosomas, una regulación asociada a la ploidía o una señal ambiental durante el desarrollo. Los sistemas XX/XY y ZZ/ZW describen combinaciones cromosómicas, mientras que la haplodiploidía y la determinación dependiente de la temperatura requieren considerar otras características del organismo. (2,7,8,9)</w:t>
       </w:r>
     </w:p>
     <w:p>
@@ -662,17 +1324,25 @@
         <w:pageBreakBefore/>
       </w:pPr>
       <w:r>
-        <w:t>4.3 Diferenciación de conductos y genitales</w:t>
+        <w:t>6.2 Sistema XX/XY</w:t>
       </w:r>
     </w:p>
     <w:p>
       <w:r>
-        <w:t>Durante el desarrollo embrionario coexisten los conductos mesonéfricos o de Wolff y los paramesonéfricos o de Müller. En el testículo fetal, las células de Sertoli secretan hormona antimülleriana (AMH), responsable de la regresión de Müller. Las células de Leydig producen testosterona, que favorece la diferenciación de Wolff hacia estructuras como epidídimo y conducto deferente. (1,5)</w:t>
+        <w:t>En los mamíferos domésticos, el modelo habitual es hembra XX y macho XY. La hembra es homogamética y el macho heterogamético. Un ovocito X fecundado por un espermatozoide X origina una combinación XX; si el espermatozoide aporta Y, se forma XY. Esta explicación se refiere al complemento cromosómico típico y debe relacionarse con las redes del desarrollo descritas anteriormente. (2)</w:t>
+      </w:r>
+    </w:p>
+    <w:p>
+      <w:pPr>
+        <w:pStyle w:val="Heading2"/>
+      </w:pPr>
+      <w:r>
+        <w:t>6.3 Sistema ZZ/ZW</w:t>
       </w:r>
     </w:p>
     <w:p>
       <w:r>
-        <w:t>La conversión local de testosterona en dihidrotestosterona (DHT), mediada por la 5α-reductasa, participa en la diferenciación de los genitales externos masculinos y la próstata. La respuesta requiere tejidos sensibles y receptores funcionales. En ausencia de la acción fetal de AMH se conservan los derivados müllerianos, mientras que sin estimulación androgénica suficiente regresan los conductos de Wolff. La formación ovárica, por su parte, depende de la regulación genética explicada antes. (1,6)</w:t>
+        <w:t>En las aves, el macho suele presentar ZZ y la hembra ZW. El macho forma gametos Z, mientras que la hembra puede formar gametos Z o W. Por ello, la heterogametia es femenina. Las letras Z y W corresponden al sistema aviar y no deben reemplazarse por X e Y como si todos los mecanismos fueran equivalentes. (7)</w:t>
       </w:r>
     </w:p>
     <w:p>
@@ -683,8 +1353,8 @@
       <w:r>
         <w:drawing>
           <wp:inline xmlns:a="http://schemas.openxmlformats.org/drawingml/2006/main" xmlns:pic="http://schemas.openxmlformats.org/drawingml/2006/picture">
-            <wp:extent cx="5120640" cy="3859682"/>
-            <wp:docPr id="3" name="Picture 3" descr="Figura 3. Diferenciación de los conductos sexuales desde un estadio embrionario indiferenciado. La presencia de vesículas seminales en el esquema no implica que existan en todas las especies. Fuente: Díaz-Hernández, Marquez y Merchant-Larios, UNAM, 2021; figura 4 de la sección 1.6. Licencia CC BY-NC-SA, sin modificaciones. (1)"/>
+            <wp:extent cx="5669280" cy="2696261"/>
+            <wp:docPr id="3" name="Picture 3" descr="Figura 3. Combinaciones cromosómicas en cuadros de Punnett de XX/XY y ZZ/ZW. Cada casilla representa una combinación posible. Elaboración propia. "/>
             <wp:cNvGraphicFramePr>
               <a:graphicFrameLocks noChangeAspect="1"/>
             </wp:cNvGraphicFramePr>
@@ -692,7 +1362,7 @@
               <a:graphicData uri="http://schemas.openxmlformats.org/drawingml/2006/picture">
                 <pic:pic>
                   <pic:nvPicPr>
-                    <pic:cNvPr id="0" name="unam_figura_4.jpg"/>
+                    <pic:cNvPr id="0" name="cruces.png"/>
                     <pic:cNvPicPr/>
                   </pic:nvPicPr>
                   <pic:blipFill>
@@ -704,7 +1374,7 @@
                   <pic:spPr>
                     <a:xfrm>
                       <a:off x="0" y="0"/>
-                      <a:ext cx="5120640" cy="3859682"/>
+                      <a:ext cx="5669280" cy="2696261"/>
                     </a:xfrm>
                     <a:prstGeom prst="rect"/>
                   </pic:spPr>
@@ -721,73 +1391,40 @@
         <w:keepLines/>
       </w:pPr>
       <w:r>
-        <w:t>Figura 3. Diferenciación de los conductos sexuales desde un estadio embrionario indiferenciado. La presencia de vesículas seminales en el esquema no implica que existan en todas las especies. Fuente: Díaz-Hernández, Marquez y Merchant-Larios, UNAM, 2021; figura 4 de la sección 1.6. Licencia CC BY-NC-SA, sin modificaciones. (1)</w:t>
+        <w:t>Figura 3. Combinaciones cromosómicas en cuadros de Punnett de XX/XY y ZZ/ZW. Cada casilla representa una combinación posible. Elaboración propia. (2,7)</w:t>
       </w:r>
     </w:p>
     <w:p>
       <w:r>
-        <w:t>La AMH no estimula por sí misma los genitales externos masculinos, y la testosterona no sustituye la función de la AMH. Separar ambas acciones permite interpretar por qué una alteración hormonal puede afectar ciertas estructuras mientras otras conservan su desarrollo. (1,5)</w:t>
+        <w:t>Bajo estos modelos mendelianos simplificados, las combinaciones esperadas son la mitad XX y la mitad XY, o la mitad ZZ y la mitad ZW. Se trata de expectativas por fecundación y no de una garantía de que cada camada o puesta contenga exactamente igual número de ambos sexos. (2,7)</w:t>
       </w:r>
     </w:p>
     <w:p>
-      <w:pPr>
-        <w:pStyle w:val="Heading1"/>
-        <w:pageBreakBefore/>
-      </w:pPr>
       <w:r>
-        <w:t>5 Sistemas básicos de determinación sexual</w:t>
+        <w:t>En pollo, la dosis funcional de DMRT1, localizado en Z, participa en la determinación gonadal. La evidencia experimental muestra que la constitución cromosómica y la organización gonadal no explican de forma idéntica todos los caracteres sexuales del soma. Para una explicación básica, la diferencia esencial entre ambos sistemas sigue siendo qué progenitor produce dos clases de gametos. (7)</w:t>
       </w:r>
     </w:p>
     <w:p>
       <w:pPr>
         <w:pStyle w:val="Heading2"/>
+        <w:pageBreakBefore/>
       </w:pPr>
       <w:r>
-        <w:t>5.1 Sistema XX XY</w:t>
+        <w:t>6.4 Haplodiploidía en la abeja melífera</w:t>
       </w:r>
     </w:p>
     <w:p>
       <w:r>
-        <w:t>En bovinos, ovinos, caprinos, porcinos, equinos, perros y gatos, el patrón cromosómico habitual es XX en hembras y XY en machos. La combinación se establece en la fecundación y se vincula con la red SRY–SOX9 descrita anteriormente. Constituye el modelo de referencia para la reproducción de mamíferos domésticos, sin excluir alteraciones cromosómicas o de la regulación gonadal. (1,2)</w:t>
+        <w:t xml:space="preserve">La haplodiploidía relaciona el desarrollo sexual con el número de juegos cromosómicos. En la abeja melífera, </w:t>
       </w:r>
-    </w:p>
-    <w:p>
-      <w:pPr>
-        <w:pStyle w:val="Heading2"/>
-      </w:pPr>
       <w:r>
-        <w:t>5.2 Sistema ZZ ZW</w:t>
+        <w:rPr>
+          <w:i/>
+        </w:rPr>
+        <w:t>Apis mellifera</w:t>
       </w:r>
-    </w:p>
-    <w:p>
       <w:r>
-        <w:t>En aves, el macho es ZZ y la hembra ZW. En el pollo, la dosis del gen DMRT1, ligado al cromosoma Z, tiene una función decisiva. Experimentalmente, animales ZZ con una sola copia funcional de DMRT1 desarrollaron ovarios, aunque conservaron características somáticas masculinas. El resultado muestra que el desarrollo gonadal y los caracteres secundarios pueden depender de mecanismos parcialmente distintos. No es correcto presentar al cromosoma W como un interruptor ovárico universal. (4)</w:t>
-      </w:r>
-    </w:p>
-    <w:p>
-      <w:pPr>
-        <w:pStyle w:val="Heading2"/>
-      </w:pPr>
-      <w:r>
-        <w:t>5.3 Sistema XX X0</w:t>
-      </w:r>
-    </w:p>
-    <w:p>
-      <w:r>
-        <w:t>En algunos insectos, las hembras tienen dos cromosomas X y los machos uno. El símbolo 0 indica ausencia de un segundo cromosoma sexual; no representa un cromosoma llamado O. Los autosomas mantienen su condición diploide. Existen otros sistemas sexuales en insectos, incluidos XY y ZW, por lo que XX/X0 no debe atribuirse a toda la clase. (8)</w:t>
-      </w:r>
-    </w:p>
-    <w:p>
-      <w:pPr>
-        <w:pStyle w:val="Heading2"/>
-      </w:pPr>
-      <w:r>
-        <w:t>5.4 Haplodiploidía y determinación complementaria</w:t>
-      </w:r>
-    </w:p>
-    <w:p>
-      <w:r>
-        <w:t>En la abeja melífera, Apis mellifera, habitualmente los huevos no fecundados originan machos haploides y los fecundados hembras diploides. El mecanismo incluye el locus csd: la heterocigosis favorece el desarrollo femenino, mientras que la hemicigosis y determinadas condiciones de homocigosis permiten desarrollo masculino. Por ello existen machos diploides y la equivalencia «huevo fecundado igual a hembra» admite excepciones. La ploidía y la información alélica deben interpretarse conjuntamente. (9)</w:t>
+        <w:t>, los huevos no fecundados originan normalmente machos haploides, con un juego de cromosomas, y las hembras son diploides. Sin embargo, la fecundación por sí sola no garantiza desarrollo femenino: también importa el estado del gen de determinación sexual complementaria, csd. (8)</w:t>
       </w:r>
     </w:p>
     <w:tbl>
@@ -799,8 +1436,8 @@
       </w:tblPr>
       <w:tblGrid>
         <w:gridCol w:w="3024"/>
-        <w:gridCol w:w="2952"/>
-        <w:gridCol w:w="3312"/>
+        <w:gridCol w:w="3096"/>
+        <w:gridCol w:w="3240"/>
       </w:tblGrid>
       <w:tr>
         <w:trPr>
@@ -813,21 +1450,21 @@
             <w:vAlign w:val="center"/>
             <w:tcBorders>
               <w:top w:val="single" w:sz="5" w:color="D9D9D9"/>
+              <w:bottom w:val="single" w:sz="5" w:color="D9D9D9"/>
               <w:left w:val="single" w:sz="5" w:color="D9D9D9"/>
-              <w:bottom w:val="single" w:sz="5" w:color="D9D9D9"/>
               <w:right w:val="single" w:sz="5" w:color="D9D9D9"/>
             </w:tcBorders>
-            <w:shd w:fill="E5E5E5"/>
+            <w:shd w:fill="E7E7E7"/>
             <w:tcMar>
               <w:top w:w="90" w:type="dxa"/>
+              <w:bottom w:w="90" w:type="dxa"/>
               <w:left w:w="90" w:type="dxa"/>
-              <w:bottom w:w="90" w:type="dxa"/>
               <w:right w:w="90" w:type="dxa"/>
             </w:tcMar>
           </w:tcPr>
           <w:p>
             <w:pPr>
-              <w:spacing w:line="252" w:lineRule="auto" w:after="40" w:before="40"/>
+              <w:spacing w:after="40" w:before="40" w:line="252" w:lineRule="auto"/>
               <w:jc w:val="left"/>
             </w:pPr>
             <w:r>
@@ -835,31 +1472,31 @@
                 <w:b/>
                 <w:sz w:val="24"/>
               </w:rPr>
-              <w:t>Sistema</w:t>
+              <w:t>Condición del huevo</w:t>
             </w:r>
           </w:p>
         </w:tc>
         <w:tc>
           <w:tcPr>
-            <w:tcW w:type="dxa" w:w="2952"/>
+            <w:tcW w:type="dxa" w:w="3096"/>
             <w:vAlign w:val="center"/>
             <w:tcBorders>
               <w:top w:val="single" w:sz="5" w:color="D9D9D9"/>
+              <w:bottom w:val="single" w:sz="5" w:color="D9D9D9"/>
               <w:left w:val="single" w:sz="5" w:color="D9D9D9"/>
-              <w:bottom w:val="single" w:sz="5" w:color="D9D9D9"/>
               <w:right w:val="single" w:sz="5" w:color="D9D9D9"/>
             </w:tcBorders>
-            <w:shd w:fill="E5E5E5"/>
+            <w:shd w:fill="E7E7E7"/>
             <w:tcMar>
               <w:top w:w="90" w:type="dxa"/>
+              <w:bottom w:w="90" w:type="dxa"/>
               <w:left w:w="90" w:type="dxa"/>
-              <w:bottom w:w="90" w:type="dxa"/>
               <w:right w:w="90" w:type="dxa"/>
             </w:tcMar>
           </w:tcPr>
           <w:p>
             <w:pPr>
-              <w:spacing w:line="252" w:lineRule="auto" w:after="40" w:before="40"/>
+              <w:spacing w:after="40" w:before="40" w:line="252" w:lineRule="auto"/>
               <w:jc w:val="left"/>
             </w:pPr>
             <w:r>
@@ -867,31 +1504,31 @@
                 <w:b/>
                 <w:sz w:val="24"/>
               </w:rPr>
-              <w:t>Hembra habitual</w:t>
+              <w:t>Estado esquemático de csd</w:t>
             </w:r>
           </w:p>
         </w:tc>
         <w:tc>
           <w:tcPr>
-            <w:tcW w:type="dxa" w:w="3312"/>
+            <w:tcW w:type="dxa" w:w="3240"/>
             <w:vAlign w:val="center"/>
             <w:tcBorders>
               <w:top w:val="single" w:sz="5" w:color="D9D9D9"/>
+              <w:bottom w:val="single" w:sz="5" w:color="D9D9D9"/>
               <w:left w:val="single" w:sz="5" w:color="D9D9D9"/>
-              <w:bottom w:val="single" w:sz="5" w:color="D9D9D9"/>
               <w:right w:val="single" w:sz="5" w:color="D9D9D9"/>
             </w:tcBorders>
-            <w:shd w:fill="E5E5E5"/>
+            <w:shd w:fill="E7E7E7"/>
             <w:tcMar>
               <w:top w:w="90" w:type="dxa"/>
+              <w:bottom w:w="90" w:type="dxa"/>
               <w:left w:w="90" w:type="dxa"/>
-              <w:bottom w:w="90" w:type="dxa"/>
               <w:right w:w="90" w:type="dxa"/>
             </w:tcMar>
           </w:tcPr>
           <w:p>
             <w:pPr>
-              <w:spacing w:line="252" w:lineRule="auto" w:after="40" w:before="40"/>
+              <w:spacing w:after="40" w:before="40" w:line="252" w:lineRule="auto"/>
               <w:jc w:val="left"/>
             </w:pPr>
             <w:r>
@@ -899,7 +1536,7 @@
                 <w:b/>
                 <w:sz w:val="24"/>
               </w:rPr>
-              <w:t>Macho habitual</w:t>
+              <w:t>Resultado del modelo de Apis</w:t>
             </w:r>
           </w:p>
         </w:tc>
@@ -914,21 +1551,21 @@
             <w:vAlign w:val="center"/>
             <w:tcBorders>
               <w:top w:val="single" w:sz="5" w:color="D9D9D9"/>
+              <w:bottom w:val="single" w:sz="5" w:color="D9D9D9"/>
               <w:left w:val="single" w:sz="5" w:color="D9D9D9"/>
-              <w:bottom w:val="single" w:sz="5" w:color="D9D9D9"/>
               <w:right w:val="single" w:sz="5" w:color="D9D9D9"/>
             </w:tcBorders>
             <w:shd w:fill="FFFFFF"/>
             <w:tcMar>
               <w:top w:w="90" w:type="dxa"/>
+              <w:bottom w:w="90" w:type="dxa"/>
               <w:left w:w="90" w:type="dxa"/>
-              <w:bottom w:w="90" w:type="dxa"/>
               <w:right w:w="90" w:type="dxa"/>
             </w:tcMar>
           </w:tcPr>
           <w:p>
             <w:pPr>
-              <w:spacing w:line="252" w:lineRule="auto" w:after="40" w:before="40"/>
+              <w:spacing w:after="40" w:before="40" w:line="252" w:lineRule="auto"/>
               <w:jc w:val="left"/>
             </w:pPr>
             <w:r>
@@ -936,31 +1573,31 @@
                 <w:b w:val="0"/>
                 <w:sz w:val="24"/>
               </w:rPr>
-              <w:t>XX/XY</w:t>
+              <w:t>No fecundado, haploide n.</w:t>
             </w:r>
           </w:p>
         </w:tc>
         <w:tc>
           <w:tcPr>
-            <w:tcW w:type="dxa" w:w="2952"/>
+            <w:tcW w:type="dxa" w:w="3096"/>
             <w:vAlign w:val="center"/>
             <w:tcBorders>
               <w:top w:val="single" w:sz="5" w:color="D9D9D9"/>
+              <w:bottom w:val="single" w:sz="5" w:color="D9D9D9"/>
               <w:left w:val="single" w:sz="5" w:color="D9D9D9"/>
-              <w:bottom w:val="single" w:sz="5" w:color="D9D9D9"/>
               <w:right w:val="single" w:sz="5" w:color="D9D9D9"/>
             </w:tcBorders>
             <w:shd w:fill="FFFFFF"/>
             <w:tcMar>
               <w:top w:w="90" w:type="dxa"/>
+              <w:bottom w:w="90" w:type="dxa"/>
               <w:left w:w="90" w:type="dxa"/>
-              <w:bottom w:w="90" w:type="dxa"/>
               <w:right w:w="90" w:type="dxa"/>
             </w:tcMar>
           </w:tcPr>
           <w:p>
             <w:pPr>
-              <w:spacing w:line="252" w:lineRule="auto" w:after="40" w:before="40"/>
+              <w:spacing w:after="40" w:before="40" w:line="252" w:lineRule="auto"/>
               <w:jc w:val="left"/>
             </w:pPr>
             <w:r>
@@ -968,31 +1605,31 @@
                 <w:b w:val="0"/>
                 <w:sz w:val="24"/>
               </w:rPr>
-              <w:t>XX</w:t>
+              <w:t>Una variante A: hemicigosis.</w:t>
             </w:r>
           </w:p>
         </w:tc>
         <w:tc>
           <w:tcPr>
-            <w:tcW w:type="dxa" w:w="3312"/>
+            <w:tcW w:type="dxa" w:w="3240"/>
             <w:vAlign w:val="center"/>
             <w:tcBorders>
               <w:top w:val="single" w:sz="5" w:color="D9D9D9"/>
+              <w:bottom w:val="single" w:sz="5" w:color="D9D9D9"/>
               <w:left w:val="single" w:sz="5" w:color="D9D9D9"/>
-              <w:bottom w:val="single" w:sz="5" w:color="D9D9D9"/>
               <w:right w:val="single" w:sz="5" w:color="D9D9D9"/>
             </w:tcBorders>
             <w:shd w:fill="FFFFFF"/>
             <w:tcMar>
               <w:top w:w="90" w:type="dxa"/>
+              <w:bottom w:w="90" w:type="dxa"/>
               <w:left w:w="90" w:type="dxa"/>
-              <w:bottom w:w="90" w:type="dxa"/>
               <w:right w:w="90" w:type="dxa"/>
             </w:tcMar>
           </w:tcPr>
           <w:p>
             <w:pPr>
-              <w:spacing w:line="252" w:lineRule="auto" w:after="40" w:before="40"/>
+              <w:spacing w:after="40" w:before="40" w:line="252" w:lineRule="auto"/>
               <w:jc w:val="left"/>
             </w:pPr>
             <w:r>
@@ -1000,7 +1637,7 @@
                 <w:b w:val="0"/>
                 <w:sz w:val="24"/>
               </w:rPr>
-              <w:t>XY</w:t>
+              <w:t>Desarrollo masculino.</w:t>
             </w:r>
           </w:p>
         </w:tc>
@@ -1015,21 +1652,21 @@
             <w:vAlign w:val="center"/>
             <w:tcBorders>
               <w:top w:val="single" w:sz="5" w:color="D9D9D9"/>
+              <w:bottom w:val="single" w:sz="5" w:color="D9D9D9"/>
               <w:left w:val="single" w:sz="5" w:color="D9D9D9"/>
-              <w:bottom w:val="single" w:sz="5" w:color="D9D9D9"/>
               <w:right w:val="single" w:sz="5" w:color="D9D9D9"/>
             </w:tcBorders>
-            <w:shd w:fill="FFFFFF"/>
+            <w:shd w:fill="F7F7F7"/>
             <w:tcMar>
               <w:top w:w="90" w:type="dxa"/>
+              <w:bottom w:w="90" w:type="dxa"/>
               <w:left w:w="90" w:type="dxa"/>
-              <w:bottom w:w="90" w:type="dxa"/>
               <w:right w:w="90" w:type="dxa"/>
             </w:tcMar>
           </w:tcPr>
           <w:p>
             <w:pPr>
-              <w:spacing w:line="252" w:lineRule="auto" w:after="40" w:before="40"/>
+              <w:spacing w:after="40" w:before="40" w:line="252" w:lineRule="auto"/>
               <w:jc w:val="left"/>
             </w:pPr>
             <w:r>
@@ -1037,31 +1674,31 @@
                 <w:b w:val="0"/>
                 <w:sz w:val="24"/>
               </w:rPr>
-              <w:t>ZZ/ZW</w:t>
+              <w:t>Fecundado, diploide 2n.</w:t>
             </w:r>
           </w:p>
         </w:tc>
         <w:tc>
           <w:tcPr>
-            <w:tcW w:type="dxa" w:w="2952"/>
+            <w:tcW w:type="dxa" w:w="3096"/>
             <w:vAlign w:val="center"/>
             <w:tcBorders>
               <w:top w:val="single" w:sz="5" w:color="D9D9D9"/>
+              <w:bottom w:val="single" w:sz="5" w:color="D9D9D9"/>
               <w:left w:val="single" w:sz="5" w:color="D9D9D9"/>
-              <w:bottom w:val="single" w:sz="5" w:color="D9D9D9"/>
               <w:right w:val="single" w:sz="5" w:color="D9D9D9"/>
             </w:tcBorders>
-            <w:shd w:fill="FFFFFF"/>
+            <w:shd w:fill="F7F7F7"/>
             <w:tcMar>
               <w:top w:w="90" w:type="dxa"/>
+              <w:bottom w:w="90" w:type="dxa"/>
               <w:left w:w="90" w:type="dxa"/>
-              <w:bottom w:w="90" w:type="dxa"/>
               <w:right w:w="90" w:type="dxa"/>
             </w:tcMar>
           </w:tcPr>
           <w:p>
             <w:pPr>
-              <w:spacing w:line="252" w:lineRule="auto" w:after="40" w:before="40"/>
+              <w:spacing w:after="40" w:before="40" w:line="252" w:lineRule="auto"/>
               <w:jc w:val="left"/>
             </w:pPr>
             <w:r>
@@ -1069,31 +1706,31 @@
                 <w:b w:val="0"/>
                 <w:sz w:val="24"/>
               </w:rPr>
-              <w:t>ZW</w:t>
+              <w:t>Dos variantes A/B: heterocigosis.</w:t>
             </w:r>
           </w:p>
         </w:tc>
         <w:tc>
           <w:tcPr>
-            <w:tcW w:type="dxa" w:w="3312"/>
+            <w:tcW w:type="dxa" w:w="3240"/>
             <w:vAlign w:val="center"/>
             <w:tcBorders>
               <w:top w:val="single" w:sz="5" w:color="D9D9D9"/>
+              <w:bottom w:val="single" w:sz="5" w:color="D9D9D9"/>
               <w:left w:val="single" w:sz="5" w:color="D9D9D9"/>
-              <w:bottom w:val="single" w:sz="5" w:color="D9D9D9"/>
               <w:right w:val="single" w:sz="5" w:color="D9D9D9"/>
             </w:tcBorders>
-            <w:shd w:fill="FFFFFF"/>
+            <w:shd w:fill="F7F7F7"/>
             <w:tcMar>
               <w:top w:w="90" w:type="dxa"/>
+              <w:bottom w:w="90" w:type="dxa"/>
               <w:left w:w="90" w:type="dxa"/>
-              <w:bottom w:w="90" w:type="dxa"/>
               <w:right w:w="90" w:type="dxa"/>
             </w:tcMar>
           </w:tcPr>
           <w:p>
             <w:pPr>
-              <w:spacing w:line="252" w:lineRule="auto" w:after="40" w:before="40"/>
+              <w:spacing w:after="40" w:before="40" w:line="252" w:lineRule="auto"/>
               <w:jc w:val="left"/>
             </w:pPr>
             <w:r>
@@ -1101,7 +1738,7 @@
                 <w:b w:val="0"/>
                 <w:sz w:val="24"/>
               </w:rPr>
-              <w:t>ZZ</w:t>
+              <w:t>Desarrollo femenino.</w:t>
             </w:r>
           </w:p>
         </w:tc>
@@ -1116,21 +1753,21 @@
             <w:vAlign w:val="center"/>
             <w:tcBorders>
               <w:top w:val="single" w:sz="5" w:color="D9D9D9"/>
+              <w:bottom w:val="single" w:sz="5" w:color="D9D9D9"/>
               <w:left w:val="single" w:sz="5" w:color="D9D9D9"/>
-              <w:bottom w:val="single" w:sz="5" w:color="D9D9D9"/>
               <w:right w:val="single" w:sz="5" w:color="D9D9D9"/>
             </w:tcBorders>
             <w:shd w:fill="FFFFFF"/>
             <w:tcMar>
               <w:top w:w="90" w:type="dxa"/>
+              <w:bottom w:w="90" w:type="dxa"/>
               <w:left w:w="90" w:type="dxa"/>
-              <w:bottom w:w="90" w:type="dxa"/>
               <w:right w:w="90" w:type="dxa"/>
             </w:tcMar>
           </w:tcPr>
           <w:p>
             <w:pPr>
-              <w:spacing w:line="252" w:lineRule="auto" w:after="40" w:before="40"/>
+              <w:spacing w:after="40" w:before="40" w:line="252" w:lineRule="auto"/>
               <w:jc w:val="left"/>
             </w:pPr>
             <w:r>
@@ -1138,31 +1775,31 @@
                 <w:b w:val="0"/>
                 <w:sz w:val="24"/>
               </w:rPr>
-              <w:t>XX/X0</w:t>
+              <w:t>Fecundado, diploide 2n.</w:t>
             </w:r>
           </w:p>
         </w:tc>
         <w:tc>
           <w:tcPr>
-            <w:tcW w:type="dxa" w:w="2952"/>
+            <w:tcW w:type="dxa" w:w="3096"/>
             <w:vAlign w:val="center"/>
             <w:tcBorders>
               <w:top w:val="single" w:sz="5" w:color="D9D9D9"/>
+              <w:bottom w:val="single" w:sz="5" w:color="D9D9D9"/>
               <w:left w:val="single" w:sz="5" w:color="D9D9D9"/>
-              <w:bottom w:val="single" w:sz="5" w:color="D9D9D9"/>
               <w:right w:val="single" w:sz="5" w:color="D9D9D9"/>
             </w:tcBorders>
             <w:shd w:fill="FFFFFF"/>
             <w:tcMar>
               <w:top w:w="90" w:type="dxa"/>
+              <w:bottom w:w="90" w:type="dxa"/>
               <w:left w:w="90" w:type="dxa"/>
-              <w:bottom w:w="90" w:type="dxa"/>
               <w:right w:w="90" w:type="dxa"/>
             </w:tcMar>
           </w:tcPr>
           <w:p>
             <w:pPr>
-              <w:spacing w:line="252" w:lineRule="auto" w:after="40" w:before="40"/>
+              <w:spacing w:after="40" w:before="40" w:line="252" w:lineRule="auto"/>
               <w:jc w:val="left"/>
             </w:pPr>
             <w:r>
@@ -1170,31 +1807,31 @@
                 <w:b w:val="0"/>
                 <w:sz w:val="24"/>
               </w:rPr>
-              <w:t>XX</w:t>
+              <w:t>Variantes iguales A/A: homocigosis.</w:t>
             </w:r>
           </w:p>
         </w:tc>
         <w:tc>
           <w:tcPr>
-            <w:tcW w:type="dxa" w:w="3312"/>
+            <w:tcW w:type="dxa" w:w="3240"/>
             <w:vAlign w:val="center"/>
             <w:tcBorders>
               <w:top w:val="single" w:sz="5" w:color="D9D9D9"/>
+              <w:bottom w:val="single" w:sz="5" w:color="D9D9D9"/>
               <w:left w:val="single" w:sz="5" w:color="D9D9D9"/>
-              <w:bottom w:val="single" w:sz="5" w:color="D9D9D9"/>
               <w:right w:val="single" w:sz="5" w:color="D9D9D9"/>
             </w:tcBorders>
             <w:shd w:fill="FFFFFF"/>
             <w:tcMar>
               <w:top w:w="90" w:type="dxa"/>
+              <w:bottom w:w="90" w:type="dxa"/>
               <w:left w:w="90" w:type="dxa"/>
-              <w:bottom w:w="90" w:type="dxa"/>
               <w:right w:w="90" w:type="dxa"/>
             </w:tcMar>
           </w:tcPr>
           <w:p>
             <w:pPr>
-              <w:spacing w:line="252" w:lineRule="auto" w:after="40" w:before="40"/>
+              <w:spacing w:after="40" w:before="40" w:line="252" w:lineRule="auto"/>
               <w:jc w:val="left"/>
             </w:pPr>
             <w:r>
@@ -1202,108 +1839,7 @@
                 <w:b w:val="0"/>
                 <w:sz w:val="24"/>
               </w:rPr>
-              <w:t>X0</w:t>
-            </w:r>
-          </w:p>
-        </w:tc>
-      </w:tr>
-      <w:tr>
-        <w:trPr>
-          <w:cantSplit/>
-        </w:trPr>
-        <w:tc>
-          <w:tcPr>
-            <w:tcW w:type="dxa" w:w="3024"/>
-            <w:vAlign w:val="center"/>
-            <w:tcBorders>
-              <w:top w:val="single" w:sz="5" w:color="D9D9D9"/>
-              <w:left w:val="single" w:sz="5" w:color="D9D9D9"/>
-              <w:bottom w:val="single" w:sz="5" w:color="D9D9D9"/>
-              <w:right w:val="single" w:sz="5" w:color="D9D9D9"/>
-            </w:tcBorders>
-            <w:shd w:fill="FFFFFF"/>
-            <w:tcMar>
-              <w:top w:w="90" w:type="dxa"/>
-              <w:left w:w="90" w:type="dxa"/>
-              <w:bottom w:w="90" w:type="dxa"/>
-              <w:right w:w="90" w:type="dxa"/>
-            </w:tcMar>
-          </w:tcPr>
-          <w:p>
-            <w:pPr>
-              <w:spacing w:line="252" w:lineRule="auto" w:after="40" w:before="40"/>
-              <w:jc w:val="left"/>
-            </w:pPr>
-            <w:r>
-              <w:rPr>
-                <w:b w:val="0"/>
-                <w:sz w:val="24"/>
-              </w:rPr>
-              <w:t>Haplodiploidía</w:t>
-            </w:r>
-          </w:p>
-        </w:tc>
-        <w:tc>
-          <w:tcPr>
-            <w:tcW w:type="dxa" w:w="2952"/>
-            <w:vAlign w:val="center"/>
-            <w:tcBorders>
-              <w:top w:val="single" w:sz="5" w:color="D9D9D9"/>
-              <w:left w:val="single" w:sz="5" w:color="D9D9D9"/>
-              <w:bottom w:val="single" w:sz="5" w:color="D9D9D9"/>
-              <w:right w:val="single" w:sz="5" w:color="D9D9D9"/>
-            </w:tcBorders>
-            <w:shd w:fill="FFFFFF"/>
-            <w:tcMar>
-              <w:top w:w="90" w:type="dxa"/>
-              <w:left w:w="90" w:type="dxa"/>
-              <w:bottom w:w="90" w:type="dxa"/>
-              <w:right w:w="90" w:type="dxa"/>
-            </w:tcMar>
-          </w:tcPr>
-          <w:p>
-            <w:pPr>
-              <w:spacing w:line="252" w:lineRule="auto" w:after="40" w:before="40"/>
-              <w:jc w:val="left"/>
-            </w:pPr>
-            <w:r>
-              <w:rPr>
-                <w:b w:val="0"/>
-                <w:sz w:val="24"/>
-              </w:rPr>
-              <w:t>Diploide, 2n</w:t>
-            </w:r>
-          </w:p>
-        </w:tc>
-        <w:tc>
-          <w:tcPr>
-            <w:tcW w:type="dxa" w:w="3312"/>
-            <w:vAlign w:val="center"/>
-            <w:tcBorders>
-              <w:top w:val="single" w:sz="5" w:color="D9D9D9"/>
-              <w:left w:val="single" w:sz="5" w:color="D9D9D9"/>
-              <w:bottom w:val="single" w:sz="5" w:color="D9D9D9"/>
-              <w:right w:val="single" w:sz="5" w:color="D9D9D9"/>
-            </w:tcBorders>
-            <w:shd w:fill="FFFFFF"/>
-            <w:tcMar>
-              <w:top w:w="90" w:type="dxa"/>
-              <w:left w:w="90" w:type="dxa"/>
-              <w:bottom w:w="90" w:type="dxa"/>
-              <w:right w:w="90" w:type="dxa"/>
-            </w:tcMar>
-          </w:tcPr>
-          <w:p>
-            <w:pPr>
-              <w:spacing w:line="252" w:lineRule="auto" w:after="40" w:before="40"/>
-              <w:jc w:val="left"/>
-            </w:pPr>
-            <w:r>
-              <w:rPr>
-                <w:b w:val="0"/>
-                <w:sz w:val="24"/>
-              </w:rPr>
-              <w:t>Generalmente haploide, n</w:t>
+              <w:t>Puede originar un macho diploide.</w:t>
             </w:r>
           </w:p>
         </w:tc>
@@ -1311,78 +1847,20 @@
     </w:tbl>
     <w:p>
       <w:pPr>
+        <w:spacing w:after="0"/>
+      </w:pPr>
+    </w:p>
+    <w:p>
+      <w:pPr>
         <w:pStyle w:val="Caption"/>
       </w:pPr>
       <w:r>
-        <w:t>Tabla 1. Comparación de patrones habituales. La haplodiploidía no se define por una pareja X/Y o Z/W y admite machos diploides en la abeja melífera. Síntesis bibliográfica. (1,4,8,9)</w:t>
-      </w:r>
-    </w:p>
-    <w:p>
-      <w:pPr>
-        <w:pStyle w:val="Heading2"/>
-        <w:pageBreakBefore/>
-      </w:pPr>
-      <w:r>
-        <w:t>5.5 Determinación dependiente de la temperatura</w:t>
+        <w:t>Tabla 3. Ploidía y csd en la abeja melífera. A y B simbolizan variantes, sin representar alelos concretos ni probabilidades de una colonia. Elaboración propia. (8)</w:t>
       </w:r>
     </w:p>
     <w:p>
       <w:r>
-        <w:t>En determinados reptiles, la temperatura durante un periodo embrionario sensible influye en la vía de diferenciación gonadal. Se describen patrones con mayor producción de machos a temperaturas relativamente bajas (MF), a temperaturas relativamente altas (FM), o en un intervalo intermedio con predominio de hembras en los extremos (FMF). Estos patrones son frecuentes, pero no agotan toda la diversidad conocida. (10)</w:t>
-      </w:r>
-    </w:p>
-    <w:p>
-      <w:pPr>
-        <w:keepNext/>
-        <w:jc w:val="center"/>
-      </w:pPr>
-      <w:r>
-        <w:drawing>
-          <wp:inline xmlns:a="http://schemas.openxmlformats.org/drawingml/2006/main" xmlns:pic="http://schemas.openxmlformats.org/drawingml/2006/picture">
-            <wp:extent cx="5760720" cy="1878708"/>
-            <wp:docPr id="4" name="Picture 4" descr="Figura 4. Patrones térmicos frecuentes representados de forma conceptual. M significa macho y F hembra, ordenados según aumenta la temperatura. Las curvas no representan datos experimentales ni temperaturas de incubación recomendadas. Elaboración propia. (10)"/>
-            <wp:cNvGraphicFramePr>
-              <a:graphicFrameLocks noChangeAspect="1"/>
-            </wp:cNvGraphicFramePr>
-            <a:graphic>
-              <a:graphicData uri="http://schemas.openxmlformats.org/drawingml/2006/picture">
-                <pic:pic>
-                  <pic:nvPicPr>
-                    <pic:cNvPr id="0" name="figura_4_temperatura.png"/>
-                    <pic:cNvPicPr/>
-                  </pic:nvPicPr>
-                  <pic:blipFill>
-                    <a:blip r:embed="rId13"/>
-                    <a:stretch>
-                      <a:fillRect/>
-                    </a:stretch>
-                  </pic:blipFill>
-                  <pic:spPr>
-                    <a:xfrm>
-                      <a:off x="0" y="0"/>
-                      <a:ext cx="5760720" cy="1878708"/>
-                    </a:xfrm>
-                    <a:prstGeom prst="rect"/>
-                  </pic:spPr>
-                </pic:pic>
-              </a:graphicData>
-            </a:graphic>
-          </wp:inline>
-        </w:drawing>
-      </w:r>
-    </w:p>
-    <w:p>
-      <w:pPr>
-        <w:pStyle w:val="Caption"/>
-        <w:keepLines/>
-      </w:pPr>
-      <w:r>
-        <w:t>Figura 4. Patrones térmicos frecuentes representados de forma conceptual. M significa macho y F hembra, ordenados según aumenta la temperatura. Las curvas no representan datos experimentales ni temperaturas de incubación recomendadas. Elaboración propia. (10)</w:t>
-      </w:r>
-    </w:p>
-    <w:p>
-      <w:r>
-        <w:t>No todos los reptiles presentan este mecanismo, ni elevar la temperatura produce siempre más hembras. La especie, la población, el intervalo térmico y el periodo de exposición modifican la respuesta. Estas diferencias son relevantes al interpretar riesgos ambientales y programas de conservación. (10)</w:t>
+        <w:t>Este detalle explica por qué conviene decir que los machos son generalmente haploides. El mecanismo específico de csd en Apis no debe trasladarse automáticamente a todas las abejas, hormigas o avispas. La diferenciación entre reina y obrera es otra dimensión biológica y no equivale a la determinación de macho frente a hembra. (8)</w:t>
       </w:r>
     </w:p>
     <w:p>
@@ -1390,106 +1868,22 @@
         <w:pStyle w:val="Heading2"/>
       </w:pPr>
       <w:r>
-        <w:t>5.6 Diversidad y plasticidad sexual en peces</w:t>
+        <w:t>6.5 Determinación dependiente de la temperatura</w:t>
       </w:r>
     </w:p>
     <w:p>
       <w:r>
-        <w:t>Los teleósteos incluyen sistemas XX/XY, ZZ/ZW y mecanismos poligénicos, además de interacciones entre genes y ambiente. Sus cromosomas sexuales pueden ser poco diferenciados morfológicamente, de modo que un cariotipo similar entre machos y hembras no demuestra ausencia de determinación genética. Genes como dmrt1, amh y cyp19a1a participan en redes cuya función concreta depende de la especie. (3,11)</w:t>
+        <w:t>En algunas especies de reptiles, la temperatura durante un periodo termosensible del desarrollo embrionario influye en la vía sexual. La especie, la etapa de exposición y el patrón de respuesta condicionan el resultado. Por tanto, no puede aplicarse una misma temperatura para controlar el sexo de todas las tortugas o los cocodrilos. (9)</w:t>
       </w:r>
     </w:p>
     <w:p>
       <w:r>
-        <w:t>Algunos peces presentan hermafroditismo secuencial. En la protandria, un individuo funciona primero como macho y después como hembra, como ocurre en peces payaso. En la protoginia, la secuencia se invierte, como en determinados lábridos. Señales sociales, talla o edad pueden intervenir según la especie. Este cambio durante la vida debe distinguirse de la determinación sexual inicial y no es una propiedad de todos los peces. (12)</w:t>
-      </w:r>
-    </w:p>
-    <w:p>
-      <w:pPr>
-        <w:pStyle w:val="Heading1"/>
-        <w:pageBreakBefore/>
-      </w:pPr>
-      <w:r>
-        <w:t>6 Aplicaciones veterinarias</w:t>
-      </w:r>
-    </w:p>
-    <w:p>
-      <w:pPr>
-        <w:pStyle w:val="Heading2"/>
-      </w:pPr>
-      <w:r>
-        <w:t>6.1 Freemartinismo bovino</w:t>
+        <w:t>Los patrones MF, FM y FMF resumen respuestas distintas al aumento de temperatura. En MF predominan machos a temperaturas relativamente menores y hembras a mayores; en FM ocurre la dirección contraria. En FMF, las hembras predominan en los extremos y los machos en una zona intermedia. Son esquemas comparativos, sin umbrales universales ni indicaciones de incubación. (9)</w:t>
       </w:r>
     </w:p>
     <w:p>
       <w:r>
-        <w:t>El freemartinismo permite relacionar circulación fetal, hormonas y desarrollo reproductivo. En gestaciones gemelares macho–hembra, las anastomosis vasculares entre las placentas pueden permitir intercambio de células y señales hormonales. La hembra puede presentar quimerismo sanguíneo XX/XY y grados variables de alteración del aparato reproductor, habitualmente asociados con infertilidad. No todas las hembras cogemelas de macho desarrollan el síndrome. (13,14)</w:t>
-      </w:r>
-    </w:p>
-    <w:p>
-      <w:pPr>
-        <w:keepNext/>
-        <w:jc w:val="center"/>
-      </w:pPr>
-      <w:r>
-        <w:drawing>
-          <wp:inline xmlns:a="http://schemas.openxmlformats.org/drawingml/2006/main" xmlns:pic="http://schemas.openxmlformats.org/drawingml/2006/picture">
-            <wp:extent cx="4754880" cy="3025292"/>
-            <wp:docPr id="5" name="Picture 5" descr="Figura 5. Ilustración de conexiones vasculares placentarias entre fetos bovinos. Representa la base del intercambio fetal asociado al freemartinismo; no es una fotografía clínica. Fuente: Díaz-Hernández, Marquez y Merchant-Larios, UNAM, 2021; figura 5 de la sección 1.6. Licencia CC BY-NC-SA, sin modificaciones. (1)"/>
-            <wp:cNvGraphicFramePr>
-              <a:graphicFrameLocks noChangeAspect="1"/>
-            </wp:cNvGraphicFramePr>
-            <a:graphic>
-              <a:graphicData uri="http://schemas.openxmlformats.org/drawingml/2006/picture">
-                <pic:pic>
-                  <pic:nvPicPr>
-                    <pic:cNvPr id="0" name="unam_figura_5.jpg"/>
-                    <pic:cNvPicPr/>
-                  </pic:nvPicPr>
-                  <pic:blipFill>
-                    <a:blip r:embed="rId14"/>
-                    <a:stretch>
-                      <a:fillRect/>
-                    </a:stretch>
-                  </pic:blipFill>
-                  <pic:spPr>
-                    <a:xfrm>
-                      <a:off x="0" y="0"/>
-                      <a:ext cx="4754880" cy="3025292"/>
-                    </a:xfrm>
-                    <a:prstGeom prst="rect"/>
-                  </pic:spPr>
-                </pic:pic>
-              </a:graphicData>
-            </a:graphic>
-          </wp:inline>
-        </w:drawing>
-      </w:r>
-    </w:p>
-    <w:p>
-      <w:pPr>
-        <w:pStyle w:val="Caption"/>
-        <w:keepLines/>
-      </w:pPr>
-      <w:r>
-        <w:t>Figura 5. Ilustración de conexiones vasculares placentarias entre fetos bovinos. Representa la base del intercambio fetal asociado al freemartinismo; no es una fotografía clínica. Fuente: Díaz-Hernández, Marquez y Merchant-Larios, UNAM, 2021; figura 5 de la sección 1.6. Licencia CC BY-NC-SA, sin modificaciones. (1)</w:t>
-      </w:r>
-    </w:p>
-    <w:p>
-      <w:r>
-        <w:t>El hallazgo de dos líneas celulares en sangre no significa que todos los tejidos de la hembra hayan cambiado sus cromosomas XX por XY. La evaluación combina antecedentes del parto, exploración reproductiva y pruebas citogenéticas o moleculares, interpretadas en conjunto. Esta distinción evita clasificar la aptitud reproductiva solamente por el aspecto externo o por el antecedente de gemelaridad. (13,14)</w:t>
-      </w:r>
-    </w:p>
-    <w:p>
-      <w:pPr>
-        <w:pStyle w:val="Heading2"/>
-      </w:pPr>
-      <w:r>
-        <w:t>6.2 Alteraciones del desarrollo sexual en perros</w:t>
-      </w:r>
-    </w:p>
-    <w:p>
-      <w:r>
-        <w:t>Se han documentado perros XX y SRY negativos con tejido testicular u ovotesticular. Un estudio de 45 animales afectados de 23 razas detectó una duplicación de SOX9 en un solo caso. El resultado demuestra heterogeneidad genética y evita atribuir todos los casos a una misma variante. La valoración debe diferenciar constitución cromosómica, presencia de genes relevantes y anatomía gonadal. (15)</w:t>
+        <w:t>La comparación con XX/XY y ZZ/ZW muestra que la señal inicial puede variar entre grupos animales. En todos los casos, esa señal debe traducirse mediante regulación génica y procesos celulares para producir una trayectoria del desarrollo. (4,9)</w:t>
       </w:r>
     </w:p>
     <w:p>
@@ -1503,17 +1897,22 @@
     </w:p>
     <w:p>
       <w:r>
-        <w:t>La comparación entre sistemas permite reconocer una organización común: una señal inicial modifica redes de expresión y estas orientan la diferenciación de células y tejidos. Sin embargo, la naturaleza de esa señal y la contribución de cada vía no son uniformes. En mamíferos destaca SRY; en el pollo, la dosis de DMRT1; y en algunos reptiles, las condiciones térmicas del desarrollo. Comparar estos mecanismos exige indicar siempre la especie a la que pertenece la evidencia. (2,4,10)</w:t>
+        <w:t>Los tres ejes del trabajo responden a preguntas diferentes. Los cromosomas sexuales explican parte de la información hereditaria; la diferenciación sexual explica cómo se organizan los tejidos; y los sistemas de determinación sexual describen qué señales orientan el proceso en cada grupo. Esta separación evita utilizar una combinación cromosómica como explicación completa de la anatomía de cualquier animal. (2,4)</w:t>
       </w:r>
     </w:p>
     <w:p>
       <w:r>
-        <w:t>También es necesario separar procesos que ocurren en momentos distintos. La constitución cromosómica se establece antes de la diferenciación anatómica, mientras que el cambio sexual de ciertos peces puede producirse durante la vida adulta. El freemartinismo ilustra una alteración del ambiente fetal y el caso canino demuestra que una vía gonadal puede desviarse incluso sin SRY. Estas situaciones no representan mecanismos intercambiables. (12,13,14,15)</w:t>
+        <w:t>En la exposición oral, distinguir los cuatro niveles permite ordenar los mecanismos. El ejemplo SRY/SOX9 corresponde principalmente a la regulación gonadal. AMH, testosterona y DHT conectan el órgano fetal con sus tejidos diana. Los derivados de Müller y Wolff pertenecen al resultado anatómico. Ubicar cada concepto en su nivel reduce confusiones entre gen, hormona, célula y órgano. (2)</w:t>
       </w:r>
     </w:p>
     <w:p>
       <w:r>
-        <w:t>Para la práctica veterinaria, el principal aporte es construir una interpretación integrada. Una sospecha de alteración del desarrollo sexual requiere relacionar historia reproductiva, exploración anatómica y pruebas apropiadas, en lugar de inferir el diagnóstico a partir de una sola característica. En producción y conservación, conocer el mecanismo de cada especie permite interpretar mejor las proporciones sexuales y las decisiones reproductivas. (3,13,14,15)</w:t>
+        <w:t>La vía femenina exige explicar dos procesos relacionados: la diferenciación activa del ovario y el desarrollo de conductos y genitales. WNT4/RSPO1/β-catenina y FOXL2 respaldan el primer proceso; las condiciones de señalización fetal ayudan a comprender el segundo. Una descripción basada únicamente en la ausencia de SRY deja fuera buena parte del control del desarrollo ovárico. (4,5)</w:t>
+      </w:r>
+    </w:p>
+    <w:p>
+      <w:r>
+        <w:t>Los modelos comparativos también tienen límites. Un cuadro de Punnett expresa combinaciones esperadas, la haplodiploidía de Apis necesita considerar csd y los patrones térmicos dependen de la especie. El freemartinismo añade una relación entre individuos durante la gestación, sin convertir el antecedente de gemelaridad en un diagnóstico. Mantener estas precisiones permite simplificar el contenido sin alterar su significado biológico. (6,7,8,9)</w:t>
       </w:r>
     </w:p>
     <w:p>
@@ -1526,35 +1925,31 @@
     </w:p>
     <w:p>
       <w:r>
-        <w:t>Los cromosomas sexuales, la identidad gonadal y el fenotipo describen niveles diferentes del desarrollo. Su asociación habitual facilita el estudio de la reproducción, pero no garantiza correspondencia absoluta en todos los individuos.</w:t>
+        <w:t>Los cromosomas sexuales participan en la determinación del sexo y contienen genes con diferentes funciones. El desarrollo reproductivo también depende de genes autosómicos y de su regulación, por lo que la constitución cromosómica es una parte de la explicación. (3,4)</w:t>
       </w:r>
     </w:p>
     <w:p>
       <w:r>
-        <w:t>La diferenciación gonadal de los mamíferos depende de redes activas. SRY y SOX9 favorecen la organización testicular, mientras que RSPO1, WNT4, β-catenina y FOXL2 participan en la vía ovárica. AMH y andrógenos ejercen funciones posteriores diferentes.</w:t>
+        <w:t>La diferenciación sexual integra los niveles cromosómico, gonadal, hormonal y fenotípico. En el modelo mamífero, las redes testicular y ovárica son activas, y las señales AMH, testosterona y DHT actúan sobre tejidos diferentes. (2,5)</w:t>
       </w:r>
     </w:p>
     <w:p>
       <w:r>
-        <w:t>Los sistemas XX/XY, ZZ/ZW, XX/X0, haplodiploidía y determinación térmica muestran distintas maneras de iniciar el desarrollo sexual. Ninguno debe generalizarse a todos los grupos animales.</w:t>
+        <w:t xml:space="preserve">Los sistemas XX/XY y ZZ/ZW difieren en el sexo heterogamético. En </w:t>
+      </w:r>
+      <w:r>
+        <w:rPr>
+          <w:i/>
+        </w:rPr>
+        <w:t>Apis mellifera</w:t>
+      </w:r>
+      <w:r>
+        <w:t>, la ploidía y csd permiten comprender el desarrollo sexual, mientras que la determinación térmica exige considerar especie y periodo sensible. (7,8,9)</w:t>
       </w:r>
     </w:p>
     <w:p>
       <w:r>
-        <w:t>El freemartinismo bovino y las alteraciones XX, SRY negativas en perros demuestran la utilidad clínica de integrar cromosomas, genes, hormonas y anatomía. La diversidad de peces y reptiles refuerza la necesidad de interpretar cada especie en su contexto biológico.</w:t>
-      </w:r>
-    </w:p>
-    <w:p>
-      <w:pPr>
-        <w:pStyle w:val="Heading1"/>
-      </w:pPr>
-      <w:r>
-        <w:t>9 Glosario breve</w:t>
-      </w:r>
-    </w:p>
-    <w:p>
-      <w:r>
-        <w:t>AMH: hormona antimülleriana. DHT: dihidrotestosterona. DSD: alteraciones del desarrollo sexual. Gónada bipotencial: primordio capaz de seguir una organización testicular u ovárica. Heterogametia: producción de gametos con distintos complementos de cromosomas sexuales. Quimerismo: coexistencia de poblaciones celulares originadas en cigotos distintos.</w:t>
+        <w:t>El freemartinismo bovino muestra cómo una conexión vascular fetal puede modificar el desarrollo reproductivo de una hembra cogemela. Su interpretación requiere distinguir intercambio celular, señalización y anatomía, sin asumir que toda ternera con cogemelo macho presenta la condición. (6)</w:t>
       </w:r>
     </w:p>
     <w:p>
@@ -1563,179 +1958,202 @@
         <w:pageBreakBefore/>
       </w:pPr>
       <w:r>
-        <w:t>10 Referencias bibliográficas</w:t>
+        <w:t>9 Referencias bibliográficas</w:t>
       </w:r>
     </w:p>
     <w:p>
       <w:pPr>
         <w:keepLines/>
-        <w:spacing w:line="240" w:lineRule="auto" w:after="180"/>
-        <w:ind w:left="346" w:hanging="346"/>
+        <w:spacing w:after="200" w:line="252" w:lineRule="auto"/>
         <w:jc w:val="left"/>
       </w:pPr>
       <w:r>
-        <w:t>1. Díaz-Hernández V, Marquez Y, Merchant-Larios H. Desarrollo embrionario y diferenciación sexual. En: Reproducción de los animales domésticos [Internet]. México: Universidad Nacional Autónoma de México; 2021 [citado 17 oct 2026]. https://reproduccionanimalesdomesticos.fmvz.unam.mx/libro/capitulo1/autores.html</w:t>
+        <w:t>1. National Human Genome Research Institute. Cromosoma sexual [Internet]. Bethesda: National Human Genome Research Institute; [citado 19 oct 2026]. https://www.genome.gov/es/genetics-glossary/Cromosoma-sexual</w:t>
       </w:r>
     </w:p>
     <w:p>
       <w:pPr>
         <w:keepLines/>
-        <w:spacing w:line="240" w:lineRule="auto" w:after="180"/>
-        <w:ind w:left="346" w:hanging="346"/>
+        <w:spacing w:after="200" w:line="252" w:lineRule="auto"/>
         <w:jc w:val="left"/>
       </w:pPr>
       <w:r>
-        <w:t>2. Ridnik M, Schoenfelder S, Gonen N. Cis-Regulatory Control of Mammalian Sex Determination. Sex Dev. 2021;15(5-6):317-334. https://doi.org/10.1159/000519244</w:t>
+        <w:t>2. Díaz-Hernández V, Marquez Y, Merchant-Larios H. Desarrollo embrionario y diferenciación sexual. En: Reproducción de los animales domésticos [Internet]. México: Universidad Nacional Autónoma de México; 2021 [citado 19 oct 2026]. https://reproduccionanimalesdomesticos.fmvz.unam.mx/libro/capitulo1/autores.html</w:t>
       </w:r>
     </w:p>
     <w:p>
       <w:pPr>
         <w:keepLines/>
-        <w:spacing w:line="240" w:lineRule="auto" w:after="180"/>
-        <w:ind w:left="346" w:hanging="346"/>
+        <w:spacing w:after="200" w:line="252" w:lineRule="auto"/>
         <w:jc w:val="left"/>
       </w:pPr>
       <w:r>
-        <w:t>3. Kitano J, Ansai S, Takehana Y, Yamamoto Y. Diversity and Convergence of Sex-Determination Mechanisms in Teleost Fish. Annu Rev Anim Biosci. 2024;12:233-259. https://doi.org/10.1146/annurev-animal-021122-113935</w:t>
+        <w:t>3. National Human Genome Research Institute. Cromosomas [Internet]. Bethesda: National Human Genome Research Institute; 2019 [citado 19 oct 2026]. https://www.genome.gov/es/about-genomics/fact-sheets/Cromosomas</w:t>
       </w:r>
     </w:p>
     <w:p>
       <w:pPr>
         <w:keepLines/>
-        <w:spacing w:line="240" w:lineRule="auto" w:after="180"/>
-        <w:ind w:left="346" w:hanging="346"/>
+        <w:spacing w:after="200" w:line="252" w:lineRule="auto"/>
         <w:jc w:val="left"/>
       </w:pPr>
       <w:r>
-        <w:t>4. Ioannidis J, Taylor G, Zhao D, Liu L, Idoko-Akoh A, Gong D, et al. Primary sex determination in birds depends on DMRT1 dosage, but gonadal sex does not determine adult secondary sex characteristics. Proc Natl Acad Sci U S A. 2021;118(10):e2020909118. https://doi.org/10.1073/pnas.2020909118</w:t>
+        <w:t>4. Ridnik M, Schoenfelder S, Gonen N. Cis-Regulatory Control of Mammalian Sex Determination. Sex Dev. 2021;15(5-6):317-334. https://doi.org/10.1159/000519244</w:t>
       </w:r>
     </w:p>
     <w:p>
       <w:pPr>
         <w:keepLines/>
-        <w:spacing w:line="240" w:lineRule="auto" w:after="180"/>
-        <w:ind w:left="346" w:hanging="346"/>
+        <w:spacing w:after="200" w:line="252" w:lineRule="auto"/>
         <w:jc w:val="left"/>
       </w:pPr>
       <w:r>
-        <w:t>5. Gao Y, Wang Z, Long Y, Yang L, Jiang Y, Ding D, et al. Unveiling the roles of Sertoli cells lineage differentiation in reproductive development and disorders: a review. Front Endocrinol (Lausanne). 2024;15:1357594. https://doi.org/10.3389/fendo.2024.1357594</w:t>
+        <w:t>5. Nicol B, Estermann MA, Yao HHC, Mellouk N. Becoming female: Ovarian differentiation from an evolutionary perspective. Front Cell Dev Biol. 2022;10:944776. https://doi.org/10.3389/fcell.2022.944776</w:t>
       </w:r>
     </w:p>
     <w:p>
       <w:pPr>
         <w:keepLines/>
-        <w:spacing w:line="240" w:lineRule="auto" w:after="180"/>
-        <w:ind w:left="346" w:hanging="346"/>
+        <w:spacing w:after="200" w:line="252" w:lineRule="auto"/>
         <w:jc w:val="left"/>
       </w:pPr>
       <w:r>
-        <w:t>6. Nicol B, Estermann MA, Yao HHC, Mellouk N. Becoming female: Ovarian differentiation from an evolutionary perspective. Front Cell Dev Biol. 2022;10:944776. https://doi.org/10.3389/fcell.2022.944776</w:t>
+        <w:t>6. Corredor Camargo ES, Páez Barón EM. Freemartinismo o quimerismo XX/XY en bovinos: revisión. Rev Investig Agrar Ambient. 2009;(1):7-12. https://doi.org/10.22490/21456453.894</w:t>
       </w:r>
     </w:p>
     <w:p>
       <w:pPr>
         <w:keepLines/>
-        <w:spacing w:line="240" w:lineRule="auto" w:after="180"/>
-        <w:ind w:left="346" w:hanging="346"/>
+        <w:spacing w:after="200" w:line="252" w:lineRule="auto"/>
         <w:jc w:val="left"/>
       </w:pPr>
       <w:r>
-        <w:t>7. Uhlenhaut NH, Jakob S, Anlag K, Eisenberger T, Sekido R, Kress J, et al. Somatic sex reprogramming of adult ovaries to testes by FOXL2 ablation. Cell. 2009;139(6):1130-1142. https://doi.org/10.1016/j.cell.2009.11.021</w:t>
+        <w:t>7. Ioannidis J, Taylor G, Zhao D, Liu L, Idoko-Akoh A, Gong D, et al. Primary sex determination in birds depends on DMRT1 dosage, but gonadal sex does not determine adult secondary sex characteristics. Proc Natl Acad Sci U S A. 2021;118(10):e2020909118. https://doi.org/10.1073/pnas.2020909118</w:t>
       </w:r>
     </w:p>
     <w:p>
       <w:pPr>
         <w:keepLines/>
-        <w:spacing w:line="240" w:lineRule="auto" w:after="180"/>
-        <w:ind w:left="346" w:hanging="346"/>
+        <w:spacing w:after="200" w:line="252" w:lineRule="auto"/>
         <w:jc w:val="left"/>
       </w:pPr>
       <w:r>
-        <w:t>8. Xie X, Zhang Y, Peng H, Deng Z. Sex Chromosome Dosage Compensation in Insects. Insects. 2025;16(2):160. https://doi.org/10.3390/insects16020160</w:t>
+        <w:t>8. Seiler J, Beye M. Honeybees’ novel complementary sex-determining system: function and origin. Trends Genet. 2024;40(11):969-981. https://doi.org/10.1016/j.tig.2024.08.001</w:t>
       </w:r>
     </w:p>
     <w:p>
       <w:pPr>
         <w:keepLines/>
-        <w:pageBreakBefore/>
-        <w:spacing w:line="240" w:lineRule="auto" w:after="180"/>
-        <w:ind w:left="346" w:hanging="346"/>
+        <w:spacing w:after="200" w:line="252" w:lineRule="auto"/>
         <w:jc w:val="left"/>
       </w:pPr>
       <w:r>
-        <w:t>9. Seiler J, Beye M. Honeybees’ novel complementary sex-determining system: function and origin. Trends Genet. 2024;40(11):969-981. https://doi.org/10.1016/j.tig.2024.08.001</w:t>
+        <w:t>9. Akashi H, Hasui D, Ueda K, Ishikawa M, Takeda M, Miyagawa S. Understanding the role of environmental temperature on sex determination through comparative studies in reptiles and amphibians. J Exp Zool A Ecol Integr Physiol. 2024;341(1):48-59. https://doi.org/10.1002/jez.2760</w:t>
       </w:r>
     </w:p>
     <w:p>
       <w:pPr>
-        <w:keepLines/>
-        <w:spacing w:line="240" w:lineRule="auto" w:after="180"/>
-        <w:ind w:left="346" w:hanging="346"/>
-        <w:jc w:val="left"/>
+        <w:pStyle w:val="Heading1"/>
+        <w:pageBreakBefore/>
       </w:pPr>
       <w:r>
-        <w:t>10. Akashi H, Hasui D, Ueda K, Ishikawa M, Takeda M, Miyagawa S. Understanding the role of environmental temperature on sex determination through comparative studies in reptiles and amphibians. J Exp Zool A Ecol Integr Physiol. 2024;341(1):48-59. https://doi.org/10.1002/jez.2760</w:t>
+        <w:t>10 Anexo de preguntas para la exposición</w:t>
       </w:r>
     </w:p>
     <w:p>
       <w:pPr>
-        <w:keepLines/>
-        <w:spacing w:line="240" w:lineRule="auto" w:after="180"/>
-        <w:ind w:left="346" w:hanging="346"/>
-        <w:jc w:val="left"/>
+        <w:pStyle w:val="Heading2"/>
       </w:pPr>
       <w:r>
-        <w:t>11. Enríquez-Valencia CE, Prieto-Mojica CA, Gómez-Balanta FZ. Regulación genética de la determinación sexual y diferenciación gonadal en peces teleósteos. Entramado. 2022;18(1). https://doi.org/10.18041/1900-3803/entramado.1.7607</w:t>
+        <w:t>10.1 Heterogametia en mamíferos y aves</w:t>
+      </w:r>
+    </w:p>
+    <w:p>
+      <w:r>
+        <w:t>¿Por qué en los mamíferos el macho suele ser heterogamético, mientras que en las aves la hembra es heterogamética?</w:t>
+      </w:r>
+    </w:p>
+    <w:p>
+      <w:r>
+        <w:t>En el sistema XX/XY, el macho produce espermatozoides que aportan X o Y. En el sistema ZZ/ZW, la hembra produce ovocitos que aportan Z o W. Heterogametia describe la presencia de dos tipos de gametos respecto a los cromosomas sexuales. (2,7)</w:t>
       </w:r>
     </w:p>
     <w:p>
       <w:pPr>
-        <w:keepLines/>
-        <w:spacing w:line="240" w:lineRule="auto" w:after="180"/>
-        <w:ind w:left="346" w:hanging="346"/>
-        <w:jc w:val="left"/>
+        <w:pStyle w:val="Heading2"/>
       </w:pPr>
       <w:r>
-        <w:t>12. Casas L, Saborido-Rey F. Environmental Cues and Mechanisms Underpinning Sex Change in Fish. Sex Dev. 2021;15(1-3):108-121. https://doi.org/10.1159/000515274</w:t>
+        <w:t>10.2 Temperatura y determinación sexual</w:t>
+      </w:r>
+    </w:p>
+    <w:p>
+      <w:r>
+        <w:t>¿Puede utilizarse una misma temperatura para controlar el sexo de todas las tortugas y cocodrilos?</w:t>
+      </w:r>
+    </w:p>
+    <w:p>
+      <w:r>
+        <w:t>No existe un valor universal. El efecto depende de la especie, del periodo termosensible y del patrón de respuesta. Una temperatura relativamente alta puede relacionarse con resultados diferentes según el mecanismo estudiado. (9)</w:t>
       </w:r>
     </w:p>
     <w:p>
       <w:pPr>
-        <w:keepLines/>
-        <w:spacing w:line="240" w:lineRule="auto" w:after="180"/>
-        <w:ind w:left="346" w:hanging="346"/>
-        <w:jc w:val="left"/>
+        <w:pStyle w:val="Heading2"/>
       </w:pPr>
       <w:r>
-        <w:t>13. Corredor Camargo ES, Páez Barón EM. Freemartinismo o quimerismo XX/XY en bovinos: revisión. Rev Investig Agrar Ambient. 2009;(1):7-12. https://doi.org/10.22490/21456453.894</w:t>
+        <w:t>10.3 Freemartinismo bovino</w:t>
+      </w:r>
+    </w:p>
+    <w:p>
+      <w:r>
+        <w:t>Una ternera nace en una gestación gemelar con un macho y presenta alteraciones reproductivas. ¿Qué condición puede sospecharse y cómo se explica?</w:t>
+      </w:r>
+    </w:p>
+    <w:p>
+      <w:r>
+        <w:t>Puede sospecharse freemartinismo. Las conexiones vasculares placentarias permiten intercambio de células y señales entre los fetos, con posibles alteraciones del desarrollo reproductivo de la hembra. El antecedente y las alteraciones orientan la sospecha, que se evalúa mediante examen y pruebas pertinentes. (6)</w:t>
       </w:r>
     </w:p>
     <w:p>
       <w:pPr>
-        <w:keepLines/>
-        <w:spacing w:line="240" w:lineRule="auto" w:after="180"/>
-        <w:ind w:left="346" w:hanging="346"/>
-        <w:jc w:val="left"/>
+        <w:pStyle w:val="Heading2"/>
       </w:pPr>
       <w:r>
-        <w:t>14. Padula AM. The freemartin syndrome: an update. Anim Reprod Sci. 2005;87(1-2):93-109. https://doi.org/10.1016/j.anireprosci.2004.09.008</w:t>
+        <w:t>10.4 Función de SRY</w:t>
+      </w:r>
+    </w:p>
+    <w:p>
+      <w:r>
+        <w:t>¿Qué función cumple SRY en la diferenciación sexual de los mamíferos?</w:t>
+      </w:r>
+    </w:p>
+    <w:p>
+      <w:r>
+        <w:t>En la vía típica de numerosos mamíferos, SRY inicia una red de regulación que favorece SOX9, la diferenciación de células de Sertoli y la organización testicular. Su acción depende del contexto celular y del momento de expresión. (2,4)</w:t>
       </w:r>
     </w:p>
     <w:p>
       <w:pPr>
-        <w:keepLines/>
-        <w:spacing w:line="240" w:lineRule="auto" w:after="180"/>
-        <w:ind w:left="346" w:hanging="346"/>
-        <w:jc w:val="left"/>
+        <w:pStyle w:val="Heading2"/>
       </w:pPr>
       <w:r>
-        <w:t>15. Nowacka-Woszuk J, Szczerbal I, Stachowiak M, Szydlowski M, Nizanski W, Dzimira S, et al. Association between polymorphisms in the SOX9 region and canine disorder of sex development (78,XX; SRY-negative) revisited in a multibreed case-control study. PLoS One. 2019;14(6):e0218565. https://doi.org/10.1371/journal.pone.0218565</w:t>
+        <w:t>10.5 Participación de otros factores</w:t>
+      </w:r>
+    </w:p>
+    <w:p>
+      <w:r>
+        <w:t>¿Por qué la diferenciación sexual no depende únicamente de los cromosomas sexuales?</w:t>
+      </w:r>
+    </w:p>
+    <w:p>
+      <w:r>
+        <w:t>Porque intervienen genes autosómicos, regulación celular, producción hormonal y respuesta de los tejidos. Los cromosomas, las gónadas y la anatomía describen dimensiones distintas que deben analizarse de forma relacionada. (2,4)</w:t>
       </w:r>
     </w:p>
     <w:sectPr>
       <w:footerReference w:type="default" r:id="rId9"/>
       <w:pgSz w:w="12240" w:h="15840"/>
-      <w:pgMar w:top="1296" w:right="1440" w:bottom="1296" w:left="1440" w:header="720" w:footer="576" w:gutter="0"/>
+      <w:pgMar w:top="1152" w:right="1440" w:bottom="1152" w:left="1440" w:header="720" w:footer="504" w:gutter="0"/>
       <w:cols w:space="720"/>
       <w:titlePg/>
       <w:docGrid w:linePitch="360"/>
@@ -2120,11 +2538,12 @@
     <w:qFormat/>
     <w:rsid w:val="00FC693F"/>
     <w:pPr>
-      <w:spacing w:line="276" w:lineRule="auto" w:after="140"/>
+      <w:widowControl/>
+      <w:spacing w:line="269" w:lineRule="auto" w:after="140"/>
       <w:jc w:val="both"/>
     </w:pPr>
     <w:rPr>
-      <w:rFonts w:ascii="Times New Roman" w:hAnsi="Times New Roman" w:eastAsia="Times New Roman"/>
+      <w:rFonts w:ascii="Times New Roman" w:hAnsi="Times New Roman" w:eastAsia="Times New Roman" w:cs="Times New Roman"/>
       <w:color w:val="000000"/>
       <w:sz w:val="24"/>
     </w:rPr>
@@ -2188,7 +2607,7 @@
       <w:outlineLvl w:val="0"/>
     </w:pPr>
     <w:rPr>
-      <w:rFonts w:ascii="Times New Roman" w:hAnsi="Times New Roman" w:eastAsia="Times New Roman"/>
+      <w:rFonts w:ascii="Times New Roman" w:hAnsi="Times New Roman" w:eastAsia="Times New Roman" w:cs="Times New Roman"/>
       <w:b/>
       <w:bCs/>
       <w:color w:val="000000"/>
@@ -2212,7 +2631,7 @@
       <w:outlineLvl w:val="1"/>
     </w:pPr>
     <w:rPr>
-      <w:rFonts w:ascii="Times New Roman" w:hAnsi="Times New Roman" w:eastAsia="Times New Roman"/>
+      <w:rFonts w:ascii="Times New Roman" w:hAnsi="Times New Roman" w:eastAsia="Times New Roman" w:cs="Times New Roman"/>
       <w:b/>
       <w:bCs/>
       <w:color w:val="000000"/>
@@ -2232,11 +2651,11 @@
     <w:pPr>
       <w:keepNext/>
       <w:keepLines/>
-      <w:spacing w:before="200" w:after="0"/>
+      <w:spacing w:before="200" w:after="120"/>
       <w:outlineLvl w:val="2"/>
     </w:pPr>
     <w:rPr>
-      <w:rFonts w:ascii="Times New Roman" w:hAnsi="Times New Roman" w:eastAsia="Times New Roman"/>
+      <w:rFonts w:ascii="Times New Roman" w:hAnsi="Times New Roman" w:eastAsia="Times New Roman" w:cs="Times New Roman"/>
       <w:b/>
       <w:bCs/>
       <w:color w:val="000000"/>
@@ -2471,19 +2890,16 @@
     <w:qFormat/>
     <w:rsid w:val="00FC693F"/>
     <w:pPr>
-      <w:pBdr>
-        <w:bottom w:val="single" w:sz="8" w:space="4" w:color="4F81BD" w:themeColor="accent1"/>
-      </w:pBdr>
       <w:spacing w:after="300" w:line="240" w:lineRule="auto"/>
       <w:contextualSpacing/>
     </w:pPr>
     <w:rPr>
-      <w:rFonts w:ascii="Times New Roman" w:hAnsi="Times New Roman" w:eastAsia="Times New Roman"/>
+      <w:rFonts w:ascii="Times New Roman" w:hAnsi="Times New Roman" w:eastAsia="Times New Roman" w:cs="Times New Roman"/>
       <w:b/>
       <w:color w:val="000000"/>
       <w:spacing w:val="5"/>
       <w:kern w:val="28"/>
-      <w:sz w:val="42"/>
+      <w:sz w:val="38"/>
       <w:szCs w:val="52"/>
     </w:rPr>
   </w:style>
@@ -2516,7 +2932,7 @@
       </w:numPr>
     </w:pPr>
     <w:rPr>
-      <w:rFonts w:ascii="Times New Roman" w:hAnsi="Times New Roman" w:eastAsia="Times New Roman"/>
+      <w:rFonts w:ascii="Times New Roman" w:hAnsi="Times New Roman" w:eastAsia="Times New Roman" w:cs="Times New Roman"/>
       <w:i/>
       <w:iCs/>
       <w:color w:val="000000"/>
@@ -2659,6 +3075,11 @@
       </w:numPr>
       <w:contextualSpacing/>
     </w:pPr>
+    <w:rPr>
+      <w:rFonts w:ascii="Times New Roman" w:hAnsi="Times New Roman" w:eastAsia="Times New Roman" w:cs="Times New Roman"/>
+      <w:color w:val="000000"/>
+      <w:sz w:val="24"/>
+    </w:rPr>
   </w:style>
   <w:style w:type="paragraph" w:styleId="ListBullet2">
     <w:name w:val="List Bullet 2"/>
@@ -2918,15 +3339,15 @@
     <w:qFormat/>
     <w:rsid w:val="00FC693F"/>
     <w:pPr>
-      <w:spacing w:line="252" w:lineRule="auto"/>
+      <w:spacing w:line="252" w:lineRule="auto" w:after="180"/>
     </w:pPr>
     <w:rPr>
-      <w:rFonts w:ascii="Times New Roman" w:hAnsi="Times New Roman" w:eastAsia="Times New Roman"/>
-      <w:b/>
+      <w:rFonts w:ascii="Times New Roman" w:hAnsi="Times New Roman" w:eastAsia="Times New Roman" w:cs="Times New Roman"/>
+      <w:b w:val="0"/>
       <w:bCs/>
       <w:i w:val="0"/>
       <w:color w:val="000000"/>
-      <w:sz w:val="20"/>
+      <w:sz w:val="22"/>
       <w:szCs w:val="18"/>
     </w:rPr>
   </w:style>
@@ -2961,9 +3382,6 @@
     <w:qFormat/>
     <w:rsid w:val="00FC693F"/>
     <w:pPr>
-      <w:pBdr>
-        <w:bottom w:val="single" w:sz="4" w:space="4" w:color="4F81BD" w:themeColor="accent1"/>
-      </w:pBdr>
       <w:spacing w:before="200" w:after="280"/>
       <w:ind w:left="936" w:right="936"/>
     </w:pPr>

</xml_diff>